<commit_message>
Publish complete Campus Lost and Found project with setup documentation
</commit_message>
<xml_diff>
--- a/deliverables/College_Lost_and_Found_Report.docx
+++ b/deliverables/College_Lost_and_Found_Report.docx
@@ -31,7 +31,7 @@
         <w:br/>
         <w:t>Amrita Vishwa Vidyapeetham Chennai</w:t>
         <w:br/>
-        <w:t>24CYS401 Secure Software Engineering</w:t>
+        <w:t>20CYS401 Secure Software Engineering</w:t>
         <w:br/>
         <w:t>8 October 2026</w:t>
       </w:r>
@@ -1986,7 +1986,568 @@
         <w:pageBreakBefore/>
       </w:pPr>
       <w:r>
-        <w:t>Phase 2 Requirements Engineering</w:t>
+        <w:t>Phase 2 Requirements Engineering and Software Requirements Specification</w:t>
+      </w:r>
+    </w:p>
+    <w:p>
+      <w:pPr>
+        <w:pStyle w:val="Heading2"/>
+      </w:pPr>
+      <w:r>
+        <w:t>Software Requirements Specification SRS</w:t>
+      </w:r>
+    </w:p>
+    <w:p>
+      <w:pPr>
+        <w:keepLines/>
+      </w:pPr>
+      <w:r>
+        <w:t>This SRS specifies the College Lost and Found application submitted for 20CYS401. It defines the campus workflows, actors, interfaces, data, security requirements and acceptance criteria used by the implementation and verification evidence. Requirement identifiers R01–R16 remain the common reference for use cases, backlog stories and tests throughout the report.</w:t>
+      </w:r>
+    </w:p>
+    <w:p>
+      <w:pPr>
+        <w:pStyle w:val="Heading2"/>
+      </w:pPr>
+      <w:r>
+        <w:t>Purpose and scope</w:t>
+      </w:r>
+    </w:p>
+    <w:p>
+      <w:pPr>
+        <w:keepLines/>
+      </w:pPr>
+      <w:r>
+        <w:t>The system enables authenticated campus users to report lost or found items, search verified reports, contact a reporter privately and confirm recovery of their own report. Administrators verify or remove suspicious reports and inspect audit metadata. The application records the software workflow; a real-world handover must be confirmed by the report creator. Production campus identity federation, centrally revocable sessions and immutable external audit storage are future requirements rather than completed lab features.</w:t>
+      </w:r>
+    </w:p>
+    <w:p>
+      <w:pPr>
+        <w:pStyle w:val="Heading2"/>
+      </w:pPr>
+      <w:r>
+        <w:t>Definitions and product context</w:t>
+      </w:r>
+    </w:p>
+    <w:tbl>
+      <w:tblPr>
+        <w:tblW w:type="auto" w:w="0"/>
+        <w:tblLayout w:type="fixed"/>
+        <w:tblLook w:firstColumn="1" w:firstRow="1" w:lastColumn="0" w:lastRow="0" w:noHBand="0" w:noVBand="1" w:val="04A0"/>
+      </w:tblPr>
+      <w:tblGrid>
+        <w:gridCol w:w="2448"/>
+        <w:gridCol w:w="7272"/>
+      </w:tblGrid>
+      <w:tr>
+        <w:trPr>
+          <w:tblHeader/>
+          <w:cantSplit/>
+        </w:trPr>
+        <w:tc>
+          <w:tcPr>
+            <w:tcW w:type="dxa" w:w="2448"/>
+            <w:vAlign w:val="center"/>
+            <w:tcBorders>
+              <w:top w:val="single" w:sz="5" w:color="D9D9D9"/>
+              <w:left w:val="single" w:sz="5" w:color="D9D9D9"/>
+              <w:bottom w:val="single" w:sz="5" w:color="D9D9D9"/>
+              <w:right w:val="single" w:sz="5" w:color="D9D9D9"/>
+            </w:tcBorders>
+            <w:shd w:fill="333333"/>
+            <w:tcMar>
+              <w:top w:w="95" w:type="dxa"/>
+              <w:left w:w="95" w:type="dxa"/>
+              <w:bottom w:w="95" w:type="dxa"/>
+              <w:right w:w="95" w:type="dxa"/>
+            </w:tcMar>
+          </w:tcPr>
+          <w:p>
+            <w:pPr>
+              <w:spacing w:after="60" w:before="60"/>
+            </w:pPr>
+            <w:r>
+              <w:rPr>
+                <w:b/>
+                <w:color w:val="FFFFFF"/>
+                <w:sz w:val="17"/>
+              </w:rPr>
+              <w:t>Term</w:t>
+            </w:r>
+          </w:p>
+        </w:tc>
+        <w:tc>
+          <w:tcPr>
+            <w:tcW w:type="dxa" w:w="7272"/>
+            <w:vAlign w:val="center"/>
+            <w:tcBorders>
+              <w:top w:val="single" w:sz="5" w:color="D9D9D9"/>
+              <w:left w:val="single" w:sz="5" w:color="D9D9D9"/>
+              <w:bottom w:val="single" w:sz="5" w:color="D9D9D9"/>
+              <w:right w:val="single" w:sz="5" w:color="D9D9D9"/>
+            </w:tcBorders>
+            <w:shd w:fill="333333"/>
+            <w:tcMar>
+              <w:top w:w="95" w:type="dxa"/>
+              <w:left w:w="95" w:type="dxa"/>
+              <w:bottom w:w="95" w:type="dxa"/>
+              <w:right w:w="95" w:type="dxa"/>
+            </w:tcMar>
+          </w:tcPr>
+          <w:p>
+            <w:pPr>
+              <w:spacing w:after="60" w:before="60"/>
+            </w:pPr>
+            <w:r>
+              <w:rPr>
+                <w:b/>
+                <w:color w:val="FFFFFF"/>
+                <w:sz w:val="17"/>
+              </w:rPr>
+              <w:t>Meaning</w:t>
+            </w:r>
+          </w:p>
+        </w:tc>
+      </w:tr>
+      <w:tr>
+        <w:trPr>
+          <w:cantSplit/>
+        </w:trPr>
+        <w:tc>
+          <w:tcPr>
+            <w:tcW w:type="dxa" w:w="2448"/>
+            <w:vAlign w:val="center"/>
+            <w:tcBorders>
+              <w:top w:val="single" w:sz="5" w:color="D9D9D9"/>
+              <w:left w:val="single" w:sz="5" w:color="D9D9D9"/>
+              <w:bottom w:val="single" w:sz="5" w:color="D9D9D9"/>
+              <w:right w:val="single" w:sz="5" w:color="D9D9D9"/>
+            </w:tcBorders>
+            <w:shd w:fill="FFFFFF"/>
+            <w:tcMar>
+              <w:top w:w="95" w:type="dxa"/>
+              <w:left w:w="95" w:type="dxa"/>
+              <w:bottom w:w="95" w:type="dxa"/>
+              <w:right w:w="95" w:type="dxa"/>
+            </w:tcMar>
+          </w:tcPr>
+          <w:p>
+            <w:pPr>
+              <w:spacing w:after="60" w:before="60"/>
+            </w:pPr>
+            <w:r>
+              <w:rPr>
+                <w:b w:val="0"/>
+                <w:color w:val="000000"/>
+                <w:sz w:val="17"/>
+              </w:rPr>
+              <w:t>Campus user</w:t>
+            </w:r>
+          </w:p>
+        </w:tc>
+        <w:tc>
+          <w:tcPr>
+            <w:tcW w:type="dxa" w:w="7272"/>
+            <w:vAlign w:val="center"/>
+            <w:tcBorders>
+              <w:top w:val="single" w:sz="5" w:color="D9D9D9"/>
+              <w:left w:val="single" w:sz="5" w:color="D9D9D9"/>
+              <w:bottom w:val="single" w:sz="5" w:color="D9D9D9"/>
+              <w:right w:val="single" w:sz="5" w:color="D9D9D9"/>
+            </w:tcBorders>
+            <w:shd w:fill="FFFFFF"/>
+            <w:tcMar>
+              <w:top w:w="95" w:type="dxa"/>
+              <w:left w:w="95" w:type="dxa"/>
+              <w:bottom w:w="95" w:type="dxa"/>
+              <w:right w:w="95" w:type="dxa"/>
+            </w:tcMar>
+          </w:tcPr>
+          <w:p>
+            <w:pPr>
+              <w:spacing w:after="60" w:before="60"/>
+            </w:pPr>
+            <w:r>
+              <w:rPr>
+                <w:b w:val="0"/>
+                <w:color w:val="000000"/>
+                <w:sz w:val="17"/>
+              </w:rPr>
+              <w:t>A registered student or faculty member with the same reporting and communication permissions.</w:t>
+            </w:r>
+          </w:p>
+        </w:tc>
+      </w:tr>
+      <w:tr>
+        <w:trPr>
+          <w:cantSplit/>
+        </w:trPr>
+        <w:tc>
+          <w:tcPr>
+            <w:tcW w:type="dxa" w:w="2448"/>
+            <w:vAlign w:val="center"/>
+            <w:tcBorders>
+              <w:top w:val="single" w:sz="5" w:color="D9D9D9"/>
+              <w:left w:val="single" w:sz="5" w:color="D9D9D9"/>
+              <w:bottom w:val="single" w:sz="5" w:color="D9D9D9"/>
+              <w:right w:val="single" w:sz="5" w:color="D9D9D9"/>
+            </w:tcBorders>
+            <w:shd w:fill="F3F3F3"/>
+            <w:tcMar>
+              <w:top w:w="95" w:type="dxa"/>
+              <w:left w:w="95" w:type="dxa"/>
+              <w:bottom w:w="95" w:type="dxa"/>
+              <w:right w:w="95" w:type="dxa"/>
+            </w:tcMar>
+          </w:tcPr>
+          <w:p>
+            <w:pPr>
+              <w:spacing w:after="60" w:before="60"/>
+            </w:pPr>
+            <w:r>
+              <w:rPr>
+                <w:b w:val="0"/>
+                <w:color w:val="000000"/>
+                <w:sz w:val="17"/>
+              </w:rPr>
+              <w:t>Reporter</w:t>
+            </w:r>
+          </w:p>
+        </w:tc>
+        <w:tc>
+          <w:tcPr>
+            <w:tcW w:type="dxa" w:w="7272"/>
+            <w:vAlign w:val="center"/>
+            <w:tcBorders>
+              <w:top w:val="single" w:sz="5" w:color="D9D9D9"/>
+              <w:left w:val="single" w:sz="5" w:color="D9D9D9"/>
+              <w:bottom w:val="single" w:sz="5" w:color="D9D9D9"/>
+              <w:right w:val="single" w:sz="5" w:color="D9D9D9"/>
+            </w:tcBorders>
+            <w:shd w:fill="F3F3F3"/>
+            <w:tcMar>
+              <w:top w:w="95" w:type="dxa"/>
+              <w:left w:w="95" w:type="dxa"/>
+              <w:bottom w:w="95" w:type="dxa"/>
+              <w:right w:w="95" w:type="dxa"/>
+            </w:tcMar>
+          </w:tcPr>
+          <w:p>
+            <w:pPr>
+              <w:spacing w:after="60" w:before="60"/>
+            </w:pPr>
+            <w:r>
+              <w:rPr>
+                <w:b w:val="0"/>
+                <w:color w:val="000000"/>
+                <w:sz w:val="17"/>
+              </w:rPr>
+              <w:t>The authenticated creator of a lost or found report; owns its recovery action.</w:t>
+            </w:r>
+          </w:p>
+        </w:tc>
+      </w:tr>
+      <w:tr>
+        <w:trPr>
+          <w:cantSplit/>
+        </w:trPr>
+        <w:tc>
+          <w:tcPr>
+            <w:tcW w:type="dxa" w:w="2448"/>
+            <w:vAlign w:val="center"/>
+            <w:tcBorders>
+              <w:top w:val="single" w:sz="5" w:color="D9D9D9"/>
+              <w:left w:val="single" w:sz="5" w:color="D9D9D9"/>
+              <w:bottom w:val="single" w:sz="5" w:color="D9D9D9"/>
+              <w:right w:val="single" w:sz="5" w:color="D9D9D9"/>
+            </w:tcBorders>
+            <w:shd w:fill="FFFFFF"/>
+            <w:tcMar>
+              <w:top w:w="95" w:type="dxa"/>
+              <w:left w:w="95" w:type="dxa"/>
+              <w:bottom w:w="95" w:type="dxa"/>
+              <w:right w:w="95" w:type="dxa"/>
+            </w:tcMar>
+          </w:tcPr>
+          <w:p>
+            <w:pPr>
+              <w:spacing w:after="60" w:before="60"/>
+            </w:pPr>
+            <w:r>
+              <w:rPr>
+                <w:b w:val="0"/>
+                <w:color w:val="000000"/>
+                <w:sz w:val="17"/>
+              </w:rPr>
+              <w:t>Verified report</w:t>
+            </w:r>
+          </w:p>
+        </w:tc>
+        <w:tc>
+          <w:tcPr>
+            <w:tcW w:type="dxa" w:w="7272"/>
+            <w:vAlign w:val="center"/>
+            <w:tcBorders>
+              <w:top w:val="single" w:sz="5" w:color="D9D9D9"/>
+              <w:left w:val="single" w:sz="5" w:color="D9D9D9"/>
+              <w:bottom w:val="single" w:sz="5" w:color="D9D9D9"/>
+              <w:right w:val="single" w:sz="5" w:color="D9D9D9"/>
+            </w:tcBorders>
+            <w:shd w:fill="FFFFFF"/>
+            <w:tcMar>
+              <w:top w:w="95" w:type="dxa"/>
+              <w:left w:w="95" w:type="dxa"/>
+              <w:bottom w:w="95" w:type="dxa"/>
+              <w:right w:w="95" w:type="dxa"/>
+            </w:tcMar>
+          </w:tcPr>
+          <w:p>
+            <w:pPr>
+              <w:spacing w:after="60" w:before="60"/>
+            </w:pPr>
+            <w:r>
+              <w:rPr>
+                <w:b w:val="0"/>
+                <w:color w:val="000000"/>
+                <w:sz w:val="17"/>
+              </w:rPr>
+              <w:t>A report approved by an administrator and eligible for ordinary search.</w:t>
+            </w:r>
+          </w:p>
+        </w:tc>
+      </w:tr>
+      <w:tr>
+        <w:trPr>
+          <w:cantSplit/>
+        </w:trPr>
+        <w:tc>
+          <w:tcPr>
+            <w:tcW w:type="dxa" w:w="2448"/>
+            <w:vAlign w:val="center"/>
+            <w:tcBorders>
+              <w:top w:val="single" w:sz="5" w:color="D9D9D9"/>
+              <w:left w:val="single" w:sz="5" w:color="D9D9D9"/>
+              <w:bottom w:val="single" w:sz="5" w:color="D9D9D9"/>
+              <w:right w:val="single" w:sz="5" w:color="D9D9D9"/>
+            </w:tcBorders>
+            <w:shd w:fill="F3F3F3"/>
+            <w:tcMar>
+              <w:top w:w="95" w:type="dxa"/>
+              <w:left w:w="95" w:type="dxa"/>
+              <w:bottom w:w="95" w:type="dxa"/>
+              <w:right w:w="95" w:type="dxa"/>
+            </w:tcMar>
+          </w:tcPr>
+          <w:p>
+            <w:pPr>
+              <w:spacing w:after="60" w:before="60"/>
+            </w:pPr>
+            <w:r>
+              <w:rPr>
+                <w:b w:val="0"/>
+                <w:color w:val="000000"/>
+                <w:sz w:val="17"/>
+              </w:rPr>
+              <w:t>Recovered item</w:t>
+            </w:r>
+          </w:p>
+        </w:tc>
+        <w:tc>
+          <w:tcPr>
+            <w:tcW w:type="dxa" w:w="7272"/>
+            <w:vAlign w:val="center"/>
+            <w:tcBorders>
+              <w:top w:val="single" w:sz="5" w:color="D9D9D9"/>
+              <w:left w:val="single" w:sz="5" w:color="D9D9D9"/>
+              <w:bottom w:val="single" w:sz="5" w:color="D9D9D9"/>
+              <w:right w:val="single" w:sz="5" w:color="D9D9D9"/>
+            </w:tcBorders>
+            <w:shd w:fill="F3F3F3"/>
+            <w:tcMar>
+              <w:top w:w="95" w:type="dxa"/>
+              <w:left w:w="95" w:type="dxa"/>
+              <w:bottom w:w="95" w:type="dxa"/>
+              <w:right w:w="95" w:type="dxa"/>
+            </w:tcMar>
+          </w:tcPr>
+          <w:p>
+            <w:pPr>
+              <w:spacing w:after="60" w:before="60"/>
+            </w:pPr>
+            <w:r>
+              <w:rPr>
+                <w:b w:val="0"/>
+                <w:color w:val="000000"/>
+                <w:sz w:val="17"/>
+              </w:rPr>
+              <w:t>An open verified report closed by its creator after confirming return.</w:t>
+            </w:r>
+          </w:p>
+        </w:tc>
+      </w:tr>
+      <w:tr>
+        <w:trPr>
+          <w:cantSplit/>
+        </w:trPr>
+        <w:tc>
+          <w:tcPr>
+            <w:tcW w:type="dxa" w:w="2448"/>
+            <w:vAlign w:val="center"/>
+            <w:tcBorders>
+              <w:top w:val="single" w:sz="5" w:color="D9D9D9"/>
+              <w:left w:val="single" w:sz="5" w:color="D9D9D9"/>
+              <w:bottom w:val="single" w:sz="5" w:color="D9D9D9"/>
+              <w:right w:val="single" w:sz="5" w:color="D9D9D9"/>
+            </w:tcBorders>
+            <w:shd w:fill="FFFFFF"/>
+            <w:tcMar>
+              <w:top w:w="95" w:type="dxa"/>
+              <w:left w:w="95" w:type="dxa"/>
+              <w:bottom w:w="95" w:type="dxa"/>
+              <w:right w:w="95" w:type="dxa"/>
+            </w:tcMar>
+          </w:tcPr>
+          <w:p>
+            <w:pPr>
+              <w:spacing w:after="60" w:before="60"/>
+            </w:pPr>
+            <w:r>
+              <w:rPr>
+                <w:b w:val="0"/>
+                <w:color w:val="000000"/>
+                <w:sz w:val="17"/>
+              </w:rPr>
+              <w:t>Private conversation</w:t>
+            </w:r>
+          </w:p>
+        </w:tc>
+        <w:tc>
+          <w:tcPr>
+            <w:tcW w:type="dxa" w:w="7272"/>
+            <w:vAlign w:val="center"/>
+            <w:tcBorders>
+              <w:top w:val="single" w:sz="5" w:color="D9D9D9"/>
+              <w:left w:val="single" w:sz="5" w:color="D9D9D9"/>
+              <w:bottom w:val="single" w:sz="5" w:color="D9D9D9"/>
+              <w:right w:val="single" w:sz="5" w:color="D9D9D9"/>
+            </w:tcBorders>
+            <w:shd w:fill="FFFFFF"/>
+            <w:tcMar>
+              <w:top w:w="95" w:type="dxa"/>
+              <w:left w:w="95" w:type="dxa"/>
+              <w:bottom w:w="95" w:type="dxa"/>
+              <w:right w:w="95" w:type="dxa"/>
+            </w:tcMar>
+          </w:tcPr>
+          <w:p>
+            <w:pPr>
+              <w:spacing w:after="60" w:before="60"/>
+            </w:pPr>
+            <w:r>
+              <w:rPr>
+                <w:b w:val="0"/>
+                <w:color w:val="000000"/>
+                <w:sz w:val="17"/>
+              </w:rPr>
+              <w:t>Messages scoped to the sender and recipient of a report-related exchange.</w:t>
+            </w:r>
+          </w:p>
+        </w:tc>
+      </w:tr>
+      <w:tr>
+        <w:trPr>
+          <w:cantSplit/>
+        </w:trPr>
+        <w:tc>
+          <w:tcPr>
+            <w:tcW w:type="dxa" w:w="2448"/>
+            <w:vAlign w:val="center"/>
+            <w:tcBorders>
+              <w:top w:val="single" w:sz="5" w:color="D9D9D9"/>
+              <w:left w:val="single" w:sz="5" w:color="D9D9D9"/>
+              <w:bottom w:val="single" w:sz="5" w:color="D9D9D9"/>
+              <w:right w:val="single" w:sz="5" w:color="D9D9D9"/>
+            </w:tcBorders>
+            <w:shd w:fill="F3F3F3"/>
+            <w:tcMar>
+              <w:top w:w="95" w:type="dxa"/>
+              <w:left w:w="95" w:type="dxa"/>
+              <w:bottom w:w="95" w:type="dxa"/>
+              <w:right w:w="95" w:type="dxa"/>
+            </w:tcMar>
+          </w:tcPr>
+          <w:p>
+            <w:pPr>
+              <w:spacing w:after="60" w:before="60"/>
+            </w:pPr>
+            <w:r>
+              <w:rPr>
+                <w:b w:val="0"/>
+                <w:color w:val="000000"/>
+                <w:sz w:val="17"/>
+              </w:rPr>
+              <w:t>SRS and CIA</w:t>
+            </w:r>
+          </w:p>
+        </w:tc>
+        <w:tc>
+          <w:tcPr>
+            <w:tcW w:type="dxa" w:w="7272"/>
+            <w:vAlign w:val="center"/>
+            <w:tcBorders>
+              <w:top w:val="single" w:sz="5" w:color="D9D9D9"/>
+              <w:left w:val="single" w:sz="5" w:color="D9D9D9"/>
+              <w:bottom w:val="single" w:sz="5" w:color="D9D9D9"/>
+              <w:right w:val="single" w:sz="5" w:color="D9D9D9"/>
+            </w:tcBorders>
+            <w:shd w:fill="F3F3F3"/>
+            <w:tcMar>
+              <w:top w:w="95" w:type="dxa"/>
+              <w:left w:w="95" w:type="dxa"/>
+              <w:bottom w:w="95" w:type="dxa"/>
+              <w:right w:w="95" w:type="dxa"/>
+            </w:tcMar>
+          </w:tcPr>
+          <w:p>
+            <w:pPr>
+              <w:spacing w:after="60" w:before="60"/>
+            </w:pPr>
+            <w:r>
+              <w:rPr>
+                <w:b w:val="0"/>
+                <w:color w:val="000000"/>
+                <w:sz w:val="17"/>
+              </w:rPr>
+              <w:t>Software Requirements Specification; confidentiality, integrity and availability.</w:t>
+            </w:r>
+          </w:p>
+        </w:tc>
+      </w:tr>
+    </w:tbl>
+    <w:p>
+      <w:pPr>
+        <w:spacing w:after="20" w:line="20" w:lineRule="exact"/>
+      </w:pPr>
+      <w:r>
+        <w:rPr>
+          <w:sz w:val="2"/>
+        </w:rPr>
+      </w:r>
+    </w:p>
+    <w:p>
+      <w:pPr>
+        <w:keepLines/>
+      </w:pPr>
+      <w:r>
+        <w:t>The product is a server-rendered Flask application with SQLite persistence. Caddy terminates HTTPS for the Docker and Kubernetes laboratory deployments. Browser forms communicate with the application; the database is accessed only by server-side parameterized statements. A single Kubernetes application replica is used because the lab SQLite database is not shared multi-replica storage.</w:t>
+      </w:r>
+    </w:p>
+    <w:p>
+      <w:pPr>
+        <w:pStyle w:val="Heading2"/>
+      </w:pPr>
+      <w:r>
+        <w:t>User classes and permissions</w:t>
       </w:r>
     </w:p>
     <w:tbl>
@@ -2354,6 +2915,1040 @@
         <w:rPr>
           <w:sz w:val="2"/>
         </w:rPr>
+      </w:r>
+    </w:p>
+    <w:p>
+      <w:pPr>
+        <w:pStyle w:val="Heading2"/>
+      </w:pPr>
+      <w:r>
+        <w:t>Operating environment assumptions and constraints</w:t>
+      </w:r>
+    </w:p>
+    <w:tbl>
+      <w:tblPr>
+        <w:tblW w:type="auto" w:w="0"/>
+        <w:tblLayout w:type="fixed"/>
+        <w:tblLook w:firstColumn="1" w:firstRow="1" w:lastColumn="0" w:lastRow="0" w:noHBand="0" w:noVBand="1" w:val="04A0"/>
+      </w:tblPr>
+      <w:tblGrid>
+        <w:gridCol w:w="2160"/>
+        <w:gridCol w:w="7560"/>
+      </w:tblGrid>
+      <w:tr>
+        <w:trPr>
+          <w:tblHeader/>
+          <w:cantSplit/>
+        </w:trPr>
+        <w:tc>
+          <w:tcPr>
+            <w:tcW w:type="dxa" w:w="2160"/>
+            <w:vAlign w:val="center"/>
+            <w:tcBorders>
+              <w:top w:val="single" w:sz="5" w:color="D9D9D9"/>
+              <w:left w:val="single" w:sz="5" w:color="D9D9D9"/>
+              <w:bottom w:val="single" w:sz="5" w:color="D9D9D9"/>
+              <w:right w:val="single" w:sz="5" w:color="D9D9D9"/>
+            </w:tcBorders>
+            <w:shd w:fill="333333"/>
+            <w:tcMar>
+              <w:top w:w="95" w:type="dxa"/>
+              <w:left w:w="95" w:type="dxa"/>
+              <w:bottom w:w="95" w:type="dxa"/>
+              <w:right w:w="95" w:type="dxa"/>
+            </w:tcMar>
+          </w:tcPr>
+          <w:p>
+            <w:pPr>
+              <w:spacing w:after="60" w:before="60"/>
+            </w:pPr>
+            <w:r>
+              <w:rPr>
+                <w:b/>
+                <w:color w:val="FFFFFF"/>
+                <w:sz w:val="17"/>
+              </w:rPr>
+              <w:t>Area</w:t>
+            </w:r>
+          </w:p>
+        </w:tc>
+        <w:tc>
+          <w:tcPr>
+            <w:tcW w:type="dxa" w:w="7560"/>
+            <w:vAlign w:val="center"/>
+            <w:tcBorders>
+              <w:top w:val="single" w:sz="5" w:color="D9D9D9"/>
+              <w:left w:val="single" w:sz="5" w:color="D9D9D9"/>
+              <w:bottom w:val="single" w:sz="5" w:color="D9D9D9"/>
+              <w:right w:val="single" w:sz="5" w:color="D9D9D9"/>
+            </w:tcBorders>
+            <w:shd w:fill="333333"/>
+            <w:tcMar>
+              <w:top w:w="95" w:type="dxa"/>
+              <w:left w:w="95" w:type="dxa"/>
+              <w:bottom w:w="95" w:type="dxa"/>
+              <w:right w:w="95" w:type="dxa"/>
+            </w:tcMar>
+          </w:tcPr>
+          <w:p>
+            <w:pPr>
+              <w:spacing w:after="60" w:before="60"/>
+            </w:pPr>
+            <w:r>
+              <w:rPr>
+                <w:b/>
+                <w:color w:val="FFFFFF"/>
+                <w:sz w:val="17"/>
+              </w:rPr>
+              <w:t>Specification</w:t>
+            </w:r>
+          </w:p>
+        </w:tc>
+      </w:tr>
+      <w:tr>
+        <w:trPr>
+          <w:cantSplit/>
+        </w:trPr>
+        <w:tc>
+          <w:tcPr>
+            <w:tcW w:type="dxa" w:w="2160"/>
+            <w:vAlign w:val="center"/>
+            <w:tcBorders>
+              <w:top w:val="single" w:sz="5" w:color="D9D9D9"/>
+              <w:left w:val="single" w:sz="5" w:color="D9D9D9"/>
+              <w:bottom w:val="single" w:sz="5" w:color="D9D9D9"/>
+              <w:right w:val="single" w:sz="5" w:color="D9D9D9"/>
+            </w:tcBorders>
+            <w:shd w:fill="FFFFFF"/>
+            <w:tcMar>
+              <w:top w:w="95" w:type="dxa"/>
+              <w:left w:w="95" w:type="dxa"/>
+              <w:bottom w:w="95" w:type="dxa"/>
+              <w:right w:w="95" w:type="dxa"/>
+            </w:tcMar>
+          </w:tcPr>
+          <w:p>
+            <w:pPr>
+              <w:spacing w:after="60" w:before="60"/>
+            </w:pPr>
+            <w:r>
+              <w:rPr>
+                <w:b w:val="0"/>
+                <w:color w:val="000000"/>
+                <w:sz w:val="17"/>
+              </w:rPr>
+              <w:t>Environment</w:t>
+            </w:r>
+          </w:p>
+        </w:tc>
+        <w:tc>
+          <w:tcPr>
+            <w:tcW w:type="dxa" w:w="7560"/>
+            <w:vAlign w:val="center"/>
+            <w:tcBorders>
+              <w:top w:val="single" w:sz="5" w:color="D9D9D9"/>
+              <w:left w:val="single" w:sz="5" w:color="D9D9D9"/>
+              <w:bottom w:val="single" w:sz="5" w:color="D9D9D9"/>
+              <w:right w:val="single" w:sz="5" w:color="D9D9D9"/>
+            </w:tcBorders>
+            <w:shd w:fill="FFFFFF"/>
+            <w:tcMar>
+              <w:top w:w="95" w:type="dxa"/>
+              <w:left w:w="95" w:type="dxa"/>
+              <w:bottom w:w="95" w:type="dxa"/>
+              <w:right w:w="95" w:type="dxa"/>
+            </w:tcMar>
+          </w:tcPr>
+          <w:p>
+            <w:pPr>
+              <w:spacing w:after="60" w:before="60"/>
+            </w:pPr>
+            <w:r>
+              <w:rPr>
+                <w:b w:val="0"/>
+                <w:color w:val="000000"/>
+                <w:sz w:val="17"/>
+              </w:rPr>
+              <w:t>A modern browser and local Docker or isolated kind Kubernetes deployment; Python Flask Gunicorn Caddy and SQLite versions are pinned in the submitted configuration.</w:t>
+            </w:r>
+          </w:p>
+        </w:tc>
+      </w:tr>
+      <w:tr>
+        <w:trPr>
+          <w:cantSplit/>
+        </w:trPr>
+        <w:tc>
+          <w:tcPr>
+            <w:tcW w:type="dxa" w:w="2160"/>
+            <w:vAlign w:val="center"/>
+            <w:tcBorders>
+              <w:top w:val="single" w:sz="5" w:color="D9D9D9"/>
+              <w:left w:val="single" w:sz="5" w:color="D9D9D9"/>
+              <w:bottom w:val="single" w:sz="5" w:color="D9D9D9"/>
+              <w:right w:val="single" w:sz="5" w:color="D9D9D9"/>
+            </w:tcBorders>
+            <w:shd w:fill="F3F3F3"/>
+            <w:tcMar>
+              <w:top w:w="95" w:type="dxa"/>
+              <w:left w:w="95" w:type="dxa"/>
+              <w:bottom w:w="95" w:type="dxa"/>
+              <w:right w:w="95" w:type="dxa"/>
+            </w:tcMar>
+          </w:tcPr>
+          <w:p>
+            <w:pPr>
+              <w:spacing w:after="60" w:before="60"/>
+            </w:pPr>
+            <w:r>
+              <w:rPr>
+                <w:b w:val="0"/>
+                <w:color w:val="000000"/>
+                <w:sz w:val="17"/>
+              </w:rPr>
+              <w:t>Campus identity</w:t>
+            </w:r>
+          </w:p>
+        </w:tc>
+        <w:tc>
+          <w:tcPr>
+            <w:tcW w:type="dxa" w:w="7560"/>
+            <w:vAlign w:val="center"/>
+            <w:tcBorders>
+              <w:top w:val="single" w:sz="5" w:color="D9D9D9"/>
+              <w:left w:val="single" w:sz="5" w:color="D9D9D9"/>
+              <w:bottom w:val="single" w:sz="5" w:color="D9D9D9"/>
+              <w:right w:val="single" w:sz="5" w:color="D9D9D9"/>
+            </w:tcBorders>
+            <w:shd w:fill="F3F3F3"/>
+            <w:tcMar>
+              <w:top w:w="95" w:type="dxa"/>
+              <w:left w:w="95" w:type="dxa"/>
+              <w:bottom w:w="95" w:type="dxa"/>
+              <w:right w:w="95" w:type="dxa"/>
+            </w:tcMar>
+          </w:tcPr>
+          <w:p>
+            <w:pPr>
+              <w:spacing w:after="60" w:before="60"/>
+            </w:pPr>
+            <w:r>
+              <w:rPr>
+                <w:b w:val="0"/>
+                <w:color w:val="000000"/>
+                <w:sz w:val="17"/>
+              </w:rPr>
+              <w:t>Lab registration records the chosen student or faculty role without independently proving membership. Campus SSO or verified institutional email is required before campus production use.</w:t>
+            </w:r>
+          </w:p>
+        </w:tc>
+      </w:tr>
+      <w:tr>
+        <w:trPr>
+          <w:cantSplit/>
+        </w:trPr>
+        <w:tc>
+          <w:tcPr>
+            <w:tcW w:type="dxa" w:w="2160"/>
+            <w:vAlign w:val="center"/>
+            <w:tcBorders>
+              <w:top w:val="single" w:sz="5" w:color="D9D9D9"/>
+              <w:left w:val="single" w:sz="5" w:color="D9D9D9"/>
+              <w:bottom w:val="single" w:sz="5" w:color="D9D9D9"/>
+              <w:right w:val="single" w:sz="5" w:color="D9D9D9"/>
+            </w:tcBorders>
+            <w:shd w:fill="FFFFFF"/>
+            <w:tcMar>
+              <w:top w:w="95" w:type="dxa"/>
+              <w:left w:w="95" w:type="dxa"/>
+              <w:bottom w:w="95" w:type="dxa"/>
+              <w:right w:w="95" w:type="dxa"/>
+            </w:tcMar>
+          </w:tcPr>
+          <w:p>
+            <w:pPr>
+              <w:spacing w:after="60" w:before="60"/>
+            </w:pPr>
+            <w:r>
+              <w:rPr>
+                <w:b w:val="0"/>
+                <w:color w:val="000000"/>
+                <w:sz w:val="17"/>
+              </w:rPr>
+              <w:t>Provisioning</w:t>
+            </w:r>
+          </w:p>
+        </w:tc>
+        <w:tc>
+          <w:tcPr>
+            <w:tcW w:type="dxa" w:w="7560"/>
+            <w:vAlign w:val="center"/>
+            <w:tcBorders>
+              <w:top w:val="single" w:sz="5" w:color="D9D9D9"/>
+              <w:left w:val="single" w:sz="5" w:color="D9D9D9"/>
+              <w:bottom w:val="single" w:sz="5" w:color="D9D9D9"/>
+              <w:right w:val="single" w:sz="5" w:color="D9D9D9"/>
+            </w:tcBorders>
+            <w:shd w:fill="FFFFFF"/>
+            <w:tcMar>
+              <w:top w:w="95" w:type="dxa"/>
+              <w:left w:w="95" w:type="dxa"/>
+              <w:bottom w:w="95" w:type="dxa"/>
+              <w:right w:w="95" w:type="dxa"/>
+            </w:tcMar>
+          </w:tcPr>
+          <w:p>
+            <w:pPr>
+              <w:spacing w:after="60" w:before="60"/>
+            </w:pPr>
+            <w:r>
+              <w:rPr>
+                <w:b w:val="0"/>
+                <w:color w:val="000000"/>
+                <w:sz w:val="17"/>
+              </w:rPr>
+              <w:t>Only the operator provisions administrators and manages runtime secrets. Public registration cannot select administrator authority.</w:t>
+            </w:r>
+          </w:p>
+        </w:tc>
+      </w:tr>
+      <w:tr>
+        <w:trPr>
+          <w:cantSplit/>
+        </w:trPr>
+        <w:tc>
+          <w:tcPr>
+            <w:tcW w:type="dxa" w:w="2160"/>
+            <w:vAlign w:val="center"/>
+            <w:tcBorders>
+              <w:top w:val="single" w:sz="5" w:color="D9D9D9"/>
+              <w:left w:val="single" w:sz="5" w:color="D9D9D9"/>
+              <w:bottom w:val="single" w:sz="5" w:color="D9D9D9"/>
+              <w:right w:val="single" w:sz="5" w:color="D9D9D9"/>
+            </w:tcBorders>
+            <w:shd w:fill="F3F3F3"/>
+            <w:tcMar>
+              <w:top w:w="95" w:type="dxa"/>
+              <w:left w:w="95" w:type="dxa"/>
+              <w:bottom w:w="95" w:type="dxa"/>
+              <w:right w:w="95" w:type="dxa"/>
+            </w:tcMar>
+          </w:tcPr>
+          <w:p>
+            <w:pPr>
+              <w:spacing w:after="60" w:before="60"/>
+            </w:pPr>
+            <w:r>
+              <w:rPr>
+                <w:b w:val="0"/>
+                <w:color w:val="000000"/>
+                <w:sz w:val="17"/>
+              </w:rPr>
+              <w:t>Moderation and handover</w:t>
+            </w:r>
+          </w:p>
+        </w:tc>
+        <w:tc>
+          <w:tcPr>
+            <w:tcW w:type="dxa" w:w="7560"/>
+            <w:vAlign w:val="center"/>
+            <w:tcBorders>
+              <w:top w:val="single" w:sz="5" w:color="D9D9D9"/>
+              <w:left w:val="single" w:sz="5" w:color="D9D9D9"/>
+              <w:bottom w:val="single" w:sz="5" w:color="D9D9D9"/>
+              <w:right w:val="single" w:sz="5" w:color="D9D9D9"/>
+            </w:tcBorders>
+            <w:shd w:fill="F3F3F3"/>
+            <w:tcMar>
+              <w:top w:w="95" w:type="dxa"/>
+              <w:left w:w="95" w:type="dxa"/>
+              <w:bottom w:w="95" w:type="dxa"/>
+              <w:right w:w="95" w:type="dxa"/>
+            </w:tcMar>
+          </w:tcPr>
+          <w:p>
+            <w:pPr>
+              <w:spacing w:after="60" w:before="60"/>
+            </w:pPr>
+            <w:r>
+              <w:rPr>
+                <w:b w:val="0"/>
+                <w:color w:val="000000"/>
+                <w:sz w:val="17"/>
+              </w:rPr>
+              <w:t>Administrators review pending reports; reporter and recipient arrange handover. Software confirmation does not prove physical possession.</w:t>
+            </w:r>
+          </w:p>
+        </w:tc>
+      </w:tr>
+      <w:tr>
+        <w:trPr>
+          <w:cantSplit/>
+        </w:trPr>
+        <w:tc>
+          <w:tcPr>
+            <w:tcW w:type="dxa" w:w="2160"/>
+            <w:vAlign w:val="center"/>
+            <w:tcBorders>
+              <w:top w:val="single" w:sz="5" w:color="D9D9D9"/>
+              <w:left w:val="single" w:sz="5" w:color="D9D9D9"/>
+              <w:bottom w:val="single" w:sz="5" w:color="D9D9D9"/>
+              <w:right w:val="single" w:sz="5" w:color="D9D9D9"/>
+            </w:tcBorders>
+            <w:shd w:fill="FFFFFF"/>
+            <w:tcMar>
+              <w:top w:w="95" w:type="dxa"/>
+              <w:left w:w="95" w:type="dxa"/>
+              <w:bottom w:w="95" w:type="dxa"/>
+              <w:right w:w="95" w:type="dxa"/>
+            </w:tcMar>
+          </w:tcPr>
+          <w:p>
+            <w:pPr>
+              <w:spacing w:after="60" w:before="60"/>
+            </w:pPr>
+            <w:r>
+              <w:rPr>
+                <w:b w:val="0"/>
+                <w:color w:val="000000"/>
+                <w:sz w:val="17"/>
+              </w:rPr>
+              <w:t>Persistence and recovery</w:t>
+            </w:r>
+          </w:p>
+        </w:tc>
+        <w:tc>
+          <w:tcPr>
+            <w:tcW w:type="dxa" w:w="7560"/>
+            <w:vAlign w:val="center"/>
+            <w:tcBorders>
+              <w:top w:val="single" w:sz="5" w:color="D9D9D9"/>
+              <w:left w:val="single" w:sz="5" w:color="D9D9D9"/>
+              <w:bottom w:val="single" w:sz="5" w:color="D9D9D9"/>
+              <w:right w:val="single" w:sz="5" w:color="D9D9D9"/>
+            </w:tcBorders>
+            <w:shd w:fill="FFFFFF"/>
+            <w:tcMar>
+              <w:top w:w="95" w:type="dxa"/>
+              <w:left w:w="95" w:type="dxa"/>
+              <w:bottom w:w="95" w:type="dxa"/>
+              <w:right w:w="95" w:type="dxa"/>
+            </w:tcMar>
+          </w:tcPr>
+          <w:p>
+            <w:pPr>
+              <w:spacing w:after="60" w:before="60"/>
+            </w:pPr>
+            <w:r>
+              <w:rPr>
+                <w:b w:val="0"/>
+                <w:color w:val="000000"/>
+                <w:sz w:val="17"/>
+              </w:rPr>
+              <w:t>SQLite volume or PVC stores private data. Operator-controlled access, backups, retention and restoration procedures are required.</w:t>
+            </w:r>
+          </w:p>
+        </w:tc>
+      </w:tr>
+      <w:tr>
+        <w:trPr>
+          <w:cantSplit/>
+        </w:trPr>
+        <w:tc>
+          <w:tcPr>
+            <w:tcW w:type="dxa" w:w="2160"/>
+            <w:vAlign w:val="center"/>
+            <w:tcBorders>
+              <w:top w:val="single" w:sz="5" w:color="D9D9D9"/>
+              <w:left w:val="single" w:sz="5" w:color="D9D9D9"/>
+              <w:bottom w:val="single" w:sz="5" w:color="D9D9D9"/>
+              <w:right w:val="single" w:sz="5" w:color="D9D9D9"/>
+            </w:tcBorders>
+            <w:shd w:fill="F3F3F3"/>
+            <w:tcMar>
+              <w:top w:w="95" w:type="dxa"/>
+              <w:left w:w="95" w:type="dxa"/>
+              <w:bottom w:w="95" w:type="dxa"/>
+              <w:right w:w="95" w:type="dxa"/>
+            </w:tcMar>
+          </w:tcPr>
+          <w:p>
+            <w:pPr>
+              <w:spacing w:after="60" w:before="60"/>
+            </w:pPr>
+            <w:r>
+              <w:rPr>
+                <w:b w:val="0"/>
+                <w:color w:val="000000"/>
+                <w:sz w:val="17"/>
+              </w:rPr>
+              <w:t>Deployment limits</w:t>
+            </w:r>
+          </w:p>
+        </w:tc>
+        <w:tc>
+          <w:tcPr>
+            <w:tcW w:type="dxa" w:w="7560"/>
+            <w:vAlign w:val="center"/>
+            <w:tcBorders>
+              <w:top w:val="single" w:sz="5" w:color="D9D9D9"/>
+              <w:left w:val="single" w:sz="5" w:color="D9D9D9"/>
+              <w:bottom w:val="single" w:sz="5" w:color="D9D9D9"/>
+              <w:right w:val="single" w:sz="5" w:color="D9D9D9"/>
+            </w:tcBorders>
+            <w:shd w:fill="F3F3F3"/>
+            <w:tcMar>
+              <w:top w:w="95" w:type="dxa"/>
+              <w:left w:w="95" w:type="dxa"/>
+              <w:bottom w:w="95" w:type="dxa"/>
+              <w:right w:w="95" w:type="dxa"/>
+            </w:tcMar>
+          </w:tcPr>
+          <w:p>
+            <w:pPr>
+              <w:spacing w:after="60" w:before="60"/>
+            </w:pPr>
+            <w:r>
+              <w:rPr>
+                <w:b w:val="0"/>
+                <w:color w:val="000000"/>
+                <w:sz w:val="17"/>
+              </w:rPr>
+              <w:t>TLS clients must trust the lab CA. Production requires a trusted campus certificate. NetworkPolicy configuration is supplied, but enforcement by the default kind CNI is not verified.</w:t>
+            </w:r>
+          </w:p>
+        </w:tc>
+      </w:tr>
+    </w:tbl>
+    <w:p>
+      <w:pPr>
+        <w:spacing w:after="20" w:line="20" w:lineRule="exact"/>
+      </w:pPr>
+      <w:r>
+        <w:rPr>
+          <w:sz w:val="2"/>
+        </w:rPr>
+      </w:r>
+    </w:p>
+    <w:p>
+      <w:pPr>
+        <w:pStyle w:val="Heading2"/>
+      </w:pPr>
+      <w:r>
+        <w:t>External interfaces and data requirements</w:t>
+      </w:r>
+    </w:p>
+    <w:tbl>
+      <w:tblPr>
+        <w:tblW w:type="auto" w:w="0"/>
+        <w:tblLayout w:type="fixed"/>
+        <w:tblLook w:firstColumn="1" w:firstRow="1" w:lastColumn="0" w:lastRow="0" w:noHBand="0" w:noVBand="1" w:val="04A0"/>
+      </w:tblPr>
+      <w:tblGrid>
+        <w:gridCol w:w="2232"/>
+        <w:gridCol w:w="7488"/>
+      </w:tblGrid>
+      <w:tr>
+        <w:trPr>
+          <w:tblHeader/>
+          <w:cantSplit/>
+        </w:trPr>
+        <w:tc>
+          <w:tcPr>
+            <w:tcW w:type="dxa" w:w="2232"/>
+            <w:vAlign w:val="center"/>
+            <w:tcBorders>
+              <w:top w:val="single" w:sz="5" w:color="D9D9D9"/>
+              <w:left w:val="single" w:sz="5" w:color="D9D9D9"/>
+              <w:bottom w:val="single" w:sz="5" w:color="D9D9D9"/>
+              <w:right w:val="single" w:sz="5" w:color="D9D9D9"/>
+            </w:tcBorders>
+            <w:shd w:fill="333333"/>
+            <w:tcMar>
+              <w:top w:w="95" w:type="dxa"/>
+              <w:left w:w="95" w:type="dxa"/>
+              <w:bottom w:w="95" w:type="dxa"/>
+              <w:right w:w="95" w:type="dxa"/>
+            </w:tcMar>
+          </w:tcPr>
+          <w:p>
+            <w:pPr>
+              <w:spacing w:after="60" w:before="60"/>
+            </w:pPr>
+            <w:r>
+              <w:rPr>
+                <w:b/>
+                <w:color w:val="FFFFFF"/>
+                <w:sz w:val="17"/>
+              </w:rPr>
+              <w:t>Interface or data</w:t>
+            </w:r>
+          </w:p>
+        </w:tc>
+        <w:tc>
+          <w:tcPr>
+            <w:tcW w:type="dxa" w:w="7488"/>
+            <w:vAlign w:val="center"/>
+            <w:tcBorders>
+              <w:top w:val="single" w:sz="5" w:color="D9D9D9"/>
+              <w:left w:val="single" w:sz="5" w:color="D9D9D9"/>
+              <w:bottom w:val="single" w:sz="5" w:color="D9D9D9"/>
+              <w:right w:val="single" w:sz="5" w:color="D9D9D9"/>
+            </w:tcBorders>
+            <w:shd w:fill="333333"/>
+            <w:tcMar>
+              <w:top w:w="95" w:type="dxa"/>
+              <w:left w:w="95" w:type="dxa"/>
+              <w:bottom w:w="95" w:type="dxa"/>
+              <w:right w:w="95" w:type="dxa"/>
+            </w:tcMar>
+          </w:tcPr>
+          <w:p>
+            <w:pPr>
+              <w:spacing w:after="60" w:before="60"/>
+            </w:pPr>
+            <w:r>
+              <w:rPr>
+                <w:b/>
+                <w:color w:val="FFFFFF"/>
+                <w:sz w:val="17"/>
+              </w:rPr>
+              <w:t>Required behavior</w:t>
+            </w:r>
+          </w:p>
+        </w:tc>
+      </w:tr>
+      <w:tr>
+        <w:trPr>
+          <w:cantSplit/>
+        </w:trPr>
+        <w:tc>
+          <w:tcPr>
+            <w:tcW w:type="dxa" w:w="2232"/>
+            <w:vAlign w:val="center"/>
+            <w:tcBorders>
+              <w:top w:val="single" w:sz="5" w:color="D9D9D9"/>
+              <w:left w:val="single" w:sz="5" w:color="D9D9D9"/>
+              <w:bottom w:val="single" w:sz="5" w:color="D9D9D9"/>
+              <w:right w:val="single" w:sz="5" w:color="D9D9D9"/>
+            </w:tcBorders>
+            <w:shd w:fill="FFFFFF"/>
+            <w:tcMar>
+              <w:top w:w="95" w:type="dxa"/>
+              <w:left w:w="95" w:type="dxa"/>
+              <w:bottom w:w="95" w:type="dxa"/>
+              <w:right w:w="95" w:type="dxa"/>
+            </w:tcMar>
+          </w:tcPr>
+          <w:p>
+            <w:pPr>
+              <w:spacing w:after="60" w:before="60"/>
+            </w:pPr>
+            <w:r>
+              <w:rPr>
+                <w:b w:val="0"/>
+                <w:color w:val="000000"/>
+                <w:sz w:val="17"/>
+              </w:rPr>
+              <w:t>User interface</w:t>
+            </w:r>
+          </w:p>
+        </w:tc>
+        <w:tc>
+          <w:tcPr>
+            <w:tcW w:type="dxa" w:w="7488"/>
+            <w:vAlign w:val="center"/>
+            <w:tcBorders>
+              <w:top w:val="single" w:sz="5" w:color="D9D9D9"/>
+              <w:left w:val="single" w:sz="5" w:color="D9D9D9"/>
+              <w:bottom w:val="single" w:sz="5" w:color="D9D9D9"/>
+              <w:right w:val="single" w:sz="5" w:color="D9D9D9"/>
+            </w:tcBorders>
+            <w:shd w:fill="FFFFFF"/>
+            <w:tcMar>
+              <w:top w:w="95" w:type="dxa"/>
+              <w:left w:w="95" w:type="dxa"/>
+              <w:bottom w:w="95" w:type="dxa"/>
+              <w:right w:w="95" w:type="dxa"/>
+            </w:tcMar>
+          </w:tcPr>
+          <w:p>
+            <w:pPr>
+              <w:spacing w:after="60" w:before="60"/>
+            </w:pPr>
+            <w:r>
+              <w:rPr>
+                <w:b w:val="0"/>
+                <w:color w:val="000000"/>
+                <w:sz w:val="17"/>
+              </w:rPr>
+              <w:t>Labelled login registration browse report details contact inbox and moderation screens; show validation feedback and report state; retain keyboard focus and responsive layout.</w:t>
+            </w:r>
+          </w:p>
+        </w:tc>
+      </w:tr>
+      <w:tr>
+        <w:trPr>
+          <w:cantSplit/>
+        </w:trPr>
+        <w:tc>
+          <w:tcPr>
+            <w:tcW w:type="dxa" w:w="2232"/>
+            <w:vAlign w:val="center"/>
+            <w:tcBorders>
+              <w:top w:val="single" w:sz="5" w:color="D9D9D9"/>
+              <w:left w:val="single" w:sz="5" w:color="D9D9D9"/>
+              <w:bottom w:val="single" w:sz="5" w:color="D9D9D9"/>
+              <w:right w:val="single" w:sz="5" w:color="D9D9D9"/>
+            </w:tcBorders>
+            <w:shd w:fill="F3F3F3"/>
+            <w:tcMar>
+              <w:top w:w="95" w:type="dxa"/>
+              <w:left w:w="95" w:type="dxa"/>
+              <w:bottom w:w="95" w:type="dxa"/>
+              <w:right w:w="95" w:type="dxa"/>
+            </w:tcMar>
+          </w:tcPr>
+          <w:p>
+            <w:pPr>
+              <w:spacing w:after="60" w:before="60"/>
+            </w:pPr>
+            <w:r>
+              <w:rPr>
+                <w:b w:val="0"/>
+                <w:color w:val="000000"/>
+                <w:sz w:val="17"/>
+              </w:rPr>
+              <w:t>Communication interface</w:t>
+            </w:r>
+          </w:p>
+        </w:tc>
+        <w:tc>
+          <w:tcPr>
+            <w:tcW w:type="dxa" w:w="7488"/>
+            <w:vAlign w:val="center"/>
+            <w:tcBorders>
+              <w:top w:val="single" w:sz="5" w:color="D9D9D9"/>
+              <w:left w:val="single" w:sz="5" w:color="D9D9D9"/>
+              <w:bottom w:val="single" w:sz="5" w:color="D9D9D9"/>
+              <w:right w:val="single" w:sz="5" w:color="D9D9D9"/>
+            </w:tcBorders>
+            <w:shd w:fill="F3F3F3"/>
+            <w:tcMar>
+              <w:top w:w="95" w:type="dxa"/>
+              <w:left w:w="95" w:type="dxa"/>
+              <w:bottom w:w="95" w:type="dxa"/>
+              <w:right w:w="95" w:type="dxa"/>
+            </w:tcMar>
+          </w:tcPr>
+          <w:p>
+            <w:pPr>
+              <w:spacing w:after="60" w:before="60"/>
+            </w:pPr>
+            <w:r>
+              <w:rPr>
+                <w:b w:val="0"/>
+                <w:color w:val="000000"/>
+                <w:sz w:val="17"/>
+              </w:rPr>
+              <w:t>HTTPS protects credentials and private contact in deployed environments; form POST operations use session-bound CSRF tokens; session cookies are HttpOnly and use deployment security settings.</w:t>
+            </w:r>
+          </w:p>
+        </w:tc>
+      </w:tr>
+      <w:tr>
+        <w:trPr>
+          <w:cantSplit/>
+        </w:trPr>
+        <w:tc>
+          <w:tcPr>
+            <w:tcW w:type="dxa" w:w="2232"/>
+            <w:vAlign w:val="center"/>
+            <w:tcBorders>
+              <w:top w:val="single" w:sz="5" w:color="D9D9D9"/>
+              <w:left w:val="single" w:sz="5" w:color="D9D9D9"/>
+              <w:bottom w:val="single" w:sz="5" w:color="D9D9D9"/>
+              <w:right w:val="single" w:sz="5" w:color="D9D9D9"/>
+            </w:tcBorders>
+            <w:shd w:fill="FFFFFF"/>
+            <w:tcMar>
+              <w:top w:w="95" w:type="dxa"/>
+              <w:left w:w="95" w:type="dxa"/>
+              <w:bottom w:w="95" w:type="dxa"/>
+              <w:right w:w="95" w:type="dxa"/>
+            </w:tcMar>
+          </w:tcPr>
+          <w:p>
+            <w:pPr>
+              <w:spacing w:after="60" w:before="60"/>
+            </w:pPr>
+            <w:r>
+              <w:rPr>
+                <w:b w:val="0"/>
+                <w:color w:val="000000"/>
+                <w:sz w:val="17"/>
+              </w:rPr>
+              <w:t>Application interface</w:t>
+            </w:r>
+          </w:p>
+        </w:tc>
+        <w:tc>
+          <w:tcPr>
+            <w:tcW w:type="dxa" w:w="7488"/>
+            <w:vAlign w:val="center"/>
+            <w:tcBorders>
+              <w:top w:val="single" w:sz="5" w:color="D9D9D9"/>
+              <w:left w:val="single" w:sz="5" w:color="D9D9D9"/>
+              <w:bottom w:val="single" w:sz="5" w:color="D9D9D9"/>
+              <w:right w:val="single" w:sz="5" w:color="D9D9D9"/>
+            </w:tcBorders>
+            <w:shd w:fill="FFFFFF"/>
+            <w:tcMar>
+              <w:top w:w="95" w:type="dxa"/>
+              <w:left w:w="95" w:type="dxa"/>
+              <w:bottom w:w="95" w:type="dxa"/>
+              <w:right w:w="95" w:type="dxa"/>
+            </w:tcMar>
+          </w:tcPr>
+          <w:p>
+            <w:pPr>
+              <w:spacing w:after="60" w:before="60"/>
+            </w:pPr>
+            <w:r>
+              <w:rPr>
+                <w:b w:val="0"/>
+                <w:color w:val="000000"/>
+                <w:sz w:val="17"/>
+              </w:rPr>
+              <w:t>Server routes implement sign-in reporting search contact reply recovery and moderation. Identity ownership and message recipients are derived on the server.</w:t>
+            </w:r>
+          </w:p>
+        </w:tc>
+      </w:tr>
+      <w:tr>
+        <w:trPr>
+          <w:cantSplit/>
+        </w:trPr>
+        <w:tc>
+          <w:tcPr>
+            <w:tcW w:type="dxa" w:w="2232"/>
+            <w:vAlign w:val="center"/>
+            <w:tcBorders>
+              <w:top w:val="single" w:sz="5" w:color="D9D9D9"/>
+              <w:left w:val="single" w:sz="5" w:color="D9D9D9"/>
+              <w:bottom w:val="single" w:sz="5" w:color="D9D9D9"/>
+              <w:right w:val="single" w:sz="5" w:color="D9D9D9"/>
+            </w:tcBorders>
+            <w:shd w:fill="F3F3F3"/>
+            <w:tcMar>
+              <w:top w:w="95" w:type="dxa"/>
+              <w:left w:w="95" w:type="dxa"/>
+              <w:bottom w:w="95" w:type="dxa"/>
+              <w:right w:w="95" w:type="dxa"/>
+            </w:tcMar>
+          </w:tcPr>
+          <w:p>
+            <w:pPr>
+              <w:spacing w:after="60" w:before="60"/>
+            </w:pPr>
+            <w:r>
+              <w:rPr>
+                <w:b w:val="0"/>
+                <w:color w:val="000000"/>
+                <w:sz w:val="17"/>
+              </w:rPr>
+              <w:t>Storage interface</w:t>
+            </w:r>
+          </w:p>
+        </w:tc>
+        <w:tc>
+          <w:tcPr>
+            <w:tcW w:type="dxa" w:w="7488"/>
+            <w:vAlign w:val="center"/>
+            <w:tcBorders>
+              <w:top w:val="single" w:sz="5" w:color="D9D9D9"/>
+              <w:left w:val="single" w:sz="5" w:color="D9D9D9"/>
+              <w:bottom w:val="single" w:sz="5" w:color="D9D9D9"/>
+              <w:right w:val="single" w:sz="5" w:color="D9D9D9"/>
+            </w:tcBorders>
+            <w:shd w:fill="F3F3F3"/>
+            <w:tcMar>
+              <w:top w:w="95" w:type="dxa"/>
+              <w:left w:w="95" w:type="dxa"/>
+              <w:bottom w:w="95" w:type="dxa"/>
+              <w:right w:w="95" w:type="dxa"/>
+            </w:tcMar>
+          </w:tcPr>
+          <w:p>
+            <w:pPr>
+              <w:spacing w:after="60" w:before="60"/>
+            </w:pPr>
+            <w:r>
+              <w:rPr>
+                <w:b w:val="0"/>
+                <w:color w:val="000000"/>
+                <w:sz w:val="17"/>
+              </w:rPr>
+              <w:t>SQLite schema uses User Report Message AuditEvent and LoginAttempt records with foreign keys and constrained report states; no browser receives direct database access.</w:t>
+            </w:r>
+          </w:p>
+        </w:tc>
+      </w:tr>
+      <w:tr>
+        <w:trPr>
+          <w:cantSplit/>
+        </w:trPr>
+        <w:tc>
+          <w:tcPr>
+            <w:tcW w:type="dxa" w:w="2232"/>
+            <w:vAlign w:val="center"/>
+            <w:tcBorders>
+              <w:top w:val="single" w:sz="5" w:color="D9D9D9"/>
+              <w:left w:val="single" w:sz="5" w:color="D9D9D9"/>
+              <w:bottom w:val="single" w:sz="5" w:color="D9D9D9"/>
+              <w:right w:val="single" w:sz="5" w:color="D9D9D9"/>
+            </w:tcBorders>
+            <w:shd w:fill="FFFFFF"/>
+            <w:tcMar>
+              <w:top w:w="95" w:type="dxa"/>
+              <w:left w:w="95" w:type="dxa"/>
+              <w:bottom w:w="95" w:type="dxa"/>
+              <w:right w:w="95" w:type="dxa"/>
+            </w:tcMar>
+          </w:tcPr>
+          <w:p>
+            <w:pPr>
+              <w:spacing w:after="60" w:before="60"/>
+            </w:pPr>
+            <w:r>
+              <w:rPr>
+                <w:b w:val="0"/>
+                <w:color w:val="000000"/>
+                <w:sz w:val="17"/>
+              </w:rPr>
+              <w:t>Public and private data</w:t>
+            </w:r>
+          </w:p>
+        </w:tc>
+        <w:tc>
+          <w:tcPr>
+            <w:tcW w:type="dxa" w:w="7488"/>
+            <w:vAlign w:val="center"/>
+            <w:tcBorders>
+              <w:top w:val="single" w:sz="5" w:color="D9D9D9"/>
+              <w:left w:val="single" w:sz="5" w:color="D9D9D9"/>
+              <w:bottom w:val="single" w:sz="5" w:color="D9D9D9"/>
+              <w:right w:val="single" w:sz="5" w:color="D9D9D9"/>
+            </w:tcBorders>
+            <w:shd w:fill="FFFFFF"/>
+            <w:tcMar>
+              <w:top w:w="95" w:type="dxa"/>
+              <w:left w:w="95" w:type="dxa"/>
+              <w:bottom w:w="95" w:type="dxa"/>
+              <w:right w:w="95" w:type="dxa"/>
+            </w:tcMar>
+          </w:tcPr>
+          <w:p>
+            <w:pPr>
+              <w:spacing w:after="60" w:before="60"/>
+            </w:pPr>
+            <w:r>
+              <w:rPr>
+                <w:b w:val="0"/>
+                <w:color w:val="000000"/>
+                <w:sz w:val="17"/>
+              </w:rPr>
+              <w:t>Search exposes verified report fields without account emails. Owners can inspect their own reports. Private message bodies are available only to participants and are omitted from audit records.</w:t>
+            </w:r>
+          </w:p>
+        </w:tc>
+      </w:tr>
+      <w:tr>
+        <w:trPr>
+          <w:cantSplit/>
+        </w:trPr>
+        <w:tc>
+          <w:tcPr>
+            <w:tcW w:type="dxa" w:w="2232"/>
+            <w:vAlign w:val="center"/>
+            <w:tcBorders>
+              <w:top w:val="single" w:sz="5" w:color="D9D9D9"/>
+              <w:left w:val="single" w:sz="5" w:color="D9D9D9"/>
+              <w:bottom w:val="single" w:sz="5" w:color="D9D9D9"/>
+              <w:right w:val="single" w:sz="5" w:color="D9D9D9"/>
+            </w:tcBorders>
+            <w:shd w:fill="F3F3F3"/>
+            <w:tcMar>
+              <w:top w:w="95" w:type="dxa"/>
+              <w:left w:w="95" w:type="dxa"/>
+              <w:bottom w:w="95" w:type="dxa"/>
+              <w:right w:w="95" w:type="dxa"/>
+            </w:tcMar>
+          </w:tcPr>
+          <w:p>
+            <w:pPr>
+              <w:spacing w:after="60" w:before="60"/>
+            </w:pPr>
+            <w:r>
+              <w:rPr>
+                <w:b w:val="0"/>
+                <w:color w:val="000000"/>
+                <w:sz w:val="17"/>
+              </w:rPr>
+              <w:t>Report lifecycle</w:t>
+            </w:r>
+          </w:p>
+        </w:tc>
+        <w:tc>
+          <w:tcPr>
+            <w:tcW w:type="dxa" w:w="7488"/>
+            <w:vAlign w:val="center"/>
+            <w:tcBorders>
+              <w:top w:val="single" w:sz="5" w:color="D9D9D9"/>
+              <w:left w:val="single" w:sz="5" w:color="D9D9D9"/>
+              <w:bottom w:val="single" w:sz="5" w:color="D9D9D9"/>
+              <w:right w:val="single" w:sz="5" w:color="D9D9D9"/>
+            </w:tcBorders>
+            <w:shd w:fill="F3F3F3"/>
+            <w:tcMar>
+              <w:top w:w="95" w:type="dxa"/>
+              <w:left w:w="95" w:type="dxa"/>
+              <w:bottom w:w="95" w:type="dxa"/>
+              <w:right w:w="95" w:type="dxa"/>
+            </w:tcMar>
+          </w:tcPr>
+          <w:p>
+            <w:pPr>
+              <w:spacing w:after="60" w:before="60"/>
+            </w:pPr>
+            <w:r>
+              <w:rPr>
+                <w:b w:val="0"/>
+                <w:color w:val="000000"/>
+                <w:sz w:val="17"/>
+              </w:rPr>
+              <w:t>Creation starts pending and open. Administrator verification enables discovery. Removal hides the report. Only the creator can recover an open verified report; duplicate recovery is rejected.</w:t>
+            </w:r>
+          </w:p>
+        </w:tc>
+      </w:tr>
+    </w:tbl>
+    <w:p>
+      <w:pPr>
+        <w:spacing w:after="20" w:line="20" w:lineRule="exact"/>
+      </w:pPr>
+      <w:r>
+        <w:rPr>
+          <w:sz w:val="2"/>
+        </w:rPr>
+      </w:r>
+    </w:p>
+    <w:p>
+      <w:pPr>
+        <w:pStyle w:val="Heading2"/>
+      </w:pPr>
+      <w:r>
+        <w:t>Functional requirements and acceptance criteria</w:t>
       </w:r>
     </w:p>
     <w:tbl>
@@ -5186,6 +6781,14 @@
         </w:rPr>
       </w:r>
     </w:p>
+    <w:p>
+      <w:pPr>
+        <w:pStyle w:val="Heading2"/>
+      </w:pPr>
+      <w:r>
+        <w:t>Nonfunctional and security requirements</w:t>
+      </w:r>
+    </w:p>
     <w:tbl>
       <w:tblPr>
         <w:tblW w:type="auto" w:w="0"/>
@@ -6326,6 +7929,22 @@
       </w:pPr>
       <w:r>
         <w:t>CIA priorities: confidentiality dominates credentials, emails, private messages and secrets; integrity dominates report ownership, moderation and recovery; availability supports search, sign-in and recovery. Authentication identifies the current database user. Authorization separately enforces administrator or reporter/participant policy. Audit records sensitive operation outcomes.</w:t>
+      </w:r>
+    </w:p>
+    <w:p>
+      <w:pPr>
+        <w:pStyle w:val="Heading2"/>
+      </w:pPr>
+      <w:r>
+        <w:t>Acceptance and requirements traceability</w:t>
+      </w:r>
+    </w:p>
+    <w:p>
+      <w:pPr>
+        <w:keepLines/>
+      </w:pPr>
+      <w:r>
+        <w:t>Acceptance requires the lost-report found-report verified-search private-contact reporter-only-recovery and administrator-moderation workflows to operate with the specified permissions. Negative cases must reject unauthorized updates, unrelated message access, invalid CSRF and malicious or excessive inputs. The retained 34-test result and Docker/Kubernetes HTTPS workflow evidence support the implemented lab requirements. N08 remains a performance target rather than a campus-load result; operational controls retain their stated limitations. Phase 16 provides the detailed requirement-to-use-case-to-story-to-source-and-test trace, using catalog.json as the identifier authority.</w:t>
       </w:r>
     </w:p>
     <w:p>
@@ -12374,6 +13993,22 @@
         <w:t>Phase 7 Threat Modeling and Security Analysis</w:t>
       </w:r>
     </w:p>
+    <w:p>
+      <w:pPr>
+        <w:pStyle w:val="Heading2"/>
+      </w:pPr>
+      <w:r>
+        <w:t>Asset Identification</w:t>
+      </w:r>
+    </w:p>
+    <w:p>
+      <w:pPr>
+        <w:keepLines/>
+      </w:pPr>
+      <w:r>
+        <w:t>Assets are identified from the SRS, DFD stores D1–D4, communication flows and deployment configuration. For each asset, identify whose information or authority it represents, where it is held and which CIA property needs protection. The following inventory uses the same A1–A9 identifiers as the threat and information-flow analysis.</w:t>
+      </w:r>
+    </w:p>
     <w:tbl>
       <w:tblPr>
         <w:tblW w:type="auto" w:w="0"/>
@@ -14047,6 +15682,1776 @@
         <w:rPr>
           <w:sz w:val="2"/>
         </w:rPr>
+      </w:r>
+    </w:p>
+    <w:tbl>
+      <w:tblPr>
+        <w:tblW w:type="auto" w:w="0"/>
+        <w:tblLayout w:type="fixed"/>
+        <w:tblLook w:firstColumn="1" w:firstRow="1" w:lastColumn="0" w:lastRow="0" w:noHBand="0" w:noVBand="1" w:val="04A0"/>
+      </w:tblPr>
+      <w:tblGrid>
+        <w:gridCol w:w="2160"/>
+        <w:gridCol w:w="2880"/>
+        <w:gridCol w:w="4680"/>
+      </w:tblGrid>
+      <w:tr>
+        <w:trPr>
+          <w:tblHeader/>
+          <w:cantSplit/>
+        </w:trPr>
+        <w:tc>
+          <w:tcPr>
+            <w:tcW w:type="dxa" w:w="2160"/>
+            <w:vAlign w:val="center"/>
+            <w:tcBorders>
+              <w:top w:val="single" w:sz="5" w:color="D9D9D9"/>
+              <w:left w:val="single" w:sz="5" w:color="D9D9D9"/>
+              <w:bottom w:val="single" w:sz="5" w:color="D9D9D9"/>
+              <w:right w:val="single" w:sz="5" w:color="D9D9D9"/>
+            </w:tcBorders>
+            <w:shd w:fill="333333"/>
+            <w:tcMar>
+              <w:top w:w="95" w:type="dxa"/>
+              <w:left w:w="95" w:type="dxa"/>
+              <w:bottom w:w="95" w:type="dxa"/>
+              <w:right w:w="95" w:type="dxa"/>
+            </w:tcMar>
+          </w:tcPr>
+          <w:p>
+            <w:pPr>
+              <w:spacing w:after="60" w:before="60"/>
+            </w:pPr>
+            <w:r>
+              <w:rPr>
+                <w:b/>
+                <w:color w:val="FFFFFF"/>
+                <w:sz w:val="17"/>
+              </w:rPr>
+              <w:t>Asset</w:t>
+            </w:r>
+          </w:p>
+        </w:tc>
+        <w:tc>
+          <w:tcPr>
+            <w:tcW w:type="dxa" w:w="2880"/>
+            <w:vAlign w:val="center"/>
+            <w:tcBorders>
+              <w:top w:val="single" w:sz="5" w:color="D9D9D9"/>
+              <w:left w:val="single" w:sz="5" w:color="D9D9D9"/>
+              <w:bottom w:val="single" w:sz="5" w:color="D9D9D9"/>
+              <w:right w:val="single" w:sz="5" w:color="D9D9D9"/>
+            </w:tcBorders>
+            <w:shd w:fill="333333"/>
+            <w:tcMar>
+              <w:top w:w="95" w:type="dxa"/>
+              <w:left w:w="95" w:type="dxa"/>
+              <w:bottom w:w="95" w:type="dxa"/>
+              <w:right w:w="95" w:type="dxa"/>
+            </w:tcMar>
+          </w:tcPr>
+          <w:p>
+            <w:pPr>
+              <w:spacing w:after="60" w:before="60"/>
+            </w:pPr>
+            <w:r>
+              <w:rPr>
+                <w:b/>
+                <w:color w:val="FFFFFF"/>
+                <w:sz w:val="17"/>
+              </w:rPr>
+              <w:t>Owner or custodian</w:t>
+            </w:r>
+          </w:p>
+        </w:tc>
+        <w:tc>
+          <w:tcPr>
+            <w:tcW w:type="dxa" w:w="4680"/>
+            <w:vAlign w:val="center"/>
+            <w:tcBorders>
+              <w:top w:val="single" w:sz="5" w:color="D9D9D9"/>
+              <w:left w:val="single" w:sz="5" w:color="D9D9D9"/>
+              <w:bottom w:val="single" w:sz="5" w:color="D9D9D9"/>
+              <w:right w:val="single" w:sz="5" w:color="D9D9D9"/>
+            </w:tcBorders>
+            <w:shd w:fill="333333"/>
+            <w:tcMar>
+              <w:top w:w="95" w:type="dxa"/>
+              <w:left w:w="95" w:type="dxa"/>
+              <w:bottom w:w="95" w:type="dxa"/>
+              <w:right w:w="95" w:type="dxa"/>
+            </w:tcMar>
+          </w:tcPr>
+          <w:p>
+            <w:pPr>
+              <w:spacing w:after="60" w:before="60"/>
+            </w:pPr>
+            <w:r>
+              <w:rPr>
+                <w:b/>
+                <w:color w:val="FFFFFF"/>
+                <w:sz w:val="17"/>
+              </w:rPr>
+              <w:t>Location and protection objective</w:t>
+            </w:r>
+          </w:p>
+        </w:tc>
+      </w:tr>
+      <w:tr>
+        <w:trPr>
+          <w:cantSplit/>
+        </w:trPr>
+        <w:tc>
+          <w:tcPr>
+            <w:tcW w:type="dxa" w:w="2160"/>
+            <w:vAlign w:val="center"/>
+            <w:tcBorders>
+              <w:top w:val="single" w:sz="5" w:color="D9D9D9"/>
+              <w:left w:val="single" w:sz="5" w:color="D9D9D9"/>
+              <w:bottom w:val="single" w:sz="5" w:color="D9D9D9"/>
+              <w:right w:val="single" w:sz="5" w:color="D9D9D9"/>
+            </w:tcBorders>
+            <w:shd w:fill="FFFFFF"/>
+            <w:tcMar>
+              <w:top w:w="95" w:type="dxa"/>
+              <w:left w:w="95" w:type="dxa"/>
+              <w:bottom w:w="95" w:type="dxa"/>
+              <w:right w:w="95" w:type="dxa"/>
+            </w:tcMar>
+          </w:tcPr>
+          <w:p>
+            <w:pPr>
+              <w:spacing w:after="60" w:before="60"/>
+            </w:pPr>
+            <w:r>
+              <w:rPr>
+                <w:b w:val="0"/>
+                <w:color w:val="000000"/>
+                <w:sz w:val="17"/>
+              </w:rPr>
+              <w:t>A1 A2 Credentials and identity</w:t>
+            </w:r>
+          </w:p>
+        </w:tc>
+        <w:tc>
+          <w:tcPr>
+            <w:tcW w:type="dxa" w:w="2880"/>
+            <w:vAlign w:val="center"/>
+            <w:tcBorders>
+              <w:top w:val="single" w:sz="5" w:color="D9D9D9"/>
+              <w:left w:val="single" w:sz="5" w:color="D9D9D9"/>
+              <w:bottom w:val="single" w:sz="5" w:color="D9D9D9"/>
+              <w:right w:val="single" w:sz="5" w:color="D9D9D9"/>
+            </w:tcBorders>
+            <w:shd w:fill="FFFFFF"/>
+            <w:tcMar>
+              <w:top w:w="95" w:type="dxa"/>
+              <w:left w:w="95" w:type="dxa"/>
+              <w:bottom w:w="95" w:type="dxa"/>
+              <w:right w:w="95" w:type="dxa"/>
+            </w:tcMar>
+          </w:tcPr>
+          <w:p>
+            <w:pPr>
+              <w:spacing w:after="60" w:before="60"/>
+            </w:pPr>
+            <w:r>
+              <w:rPr>
+                <w:b w:val="0"/>
+                <w:color w:val="000000"/>
+                <w:sz w:val="17"/>
+              </w:rPr>
+              <w:t>Account holder; identity service and operator are custodians.</w:t>
+            </w:r>
+          </w:p>
+        </w:tc>
+        <w:tc>
+          <w:tcPr>
+            <w:tcW w:type="dxa" w:w="4680"/>
+            <w:vAlign w:val="center"/>
+            <w:tcBorders>
+              <w:top w:val="single" w:sz="5" w:color="D9D9D9"/>
+              <w:left w:val="single" w:sz="5" w:color="D9D9D9"/>
+              <w:bottom w:val="single" w:sz="5" w:color="D9D9D9"/>
+              <w:right w:val="single" w:sz="5" w:color="D9D9D9"/>
+            </w:tcBorders>
+            <w:shd w:fill="FFFFFF"/>
+            <w:tcMar>
+              <w:top w:w="95" w:type="dxa"/>
+              <w:left w:w="95" w:type="dxa"/>
+              <w:bottom w:w="95" w:type="dxa"/>
+              <w:right w:w="95" w:type="dxa"/>
+            </w:tcMar>
+          </w:tcPr>
+          <w:p>
+            <w:pPr>
+              <w:spacing w:after="60" w:before="60"/>
+            </w:pPr>
+            <w:r>
+              <w:rPr>
+                <w:b w:val="0"/>
+                <w:color w:val="000000"/>
+                <w:sz w:val="17"/>
+              </w:rPr>
+              <w:t>D1 users in SQLite. Protect hashes and email confidentiality; prevent forged roles or identity changes.</w:t>
+            </w:r>
+          </w:p>
+        </w:tc>
+      </w:tr>
+      <w:tr>
+        <w:trPr>
+          <w:cantSplit/>
+        </w:trPr>
+        <w:tc>
+          <w:tcPr>
+            <w:tcW w:type="dxa" w:w="2160"/>
+            <w:vAlign w:val="center"/>
+            <w:tcBorders>
+              <w:top w:val="single" w:sz="5" w:color="D9D9D9"/>
+              <w:left w:val="single" w:sz="5" w:color="D9D9D9"/>
+              <w:bottom w:val="single" w:sz="5" w:color="D9D9D9"/>
+              <w:right w:val="single" w:sz="5" w:color="D9D9D9"/>
+            </w:tcBorders>
+            <w:shd w:fill="F3F3F3"/>
+            <w:tcMar>
+              <w:top w:w="95" w:type="dxa"/>
+              <w:left w:w="95" w:type="dxa"/>
+              <w:bottom w:w="95" w:type="dxa"/>
+              <w:right w:w="95" w:type="dxa"/>
+            </w:tcMar>
+          </w:tcPr>
+          <w:p>
+            <w:pPr>
+              <w:spacing w:after="60" w:before="60"/>
+            </w:pPr>
+            <w:r>
+              <w:rPr>
+                <w:b w:val="0"/>
+                <w:color w:val="000000"/>
+                <w:sz w:val="17"/>
+              </w:rPr>
+              <w:t>A3 Private messages</w:t>
+            </w:r>
+          </w:p>
+        </w:tc>
+        <w:tc>
+          <w:tcPr>
+            <w:tcW w:type="dxa" w:w="2880"/>
+            <w:vAlign w:val="center"/>
+            <w:tcBorders>
+              <w:top w:val="single" w:sz="5" w:color="D9D9D9"/>
+              <w:left w:val="single" w:sz="5" w:color="D9D9D9"/>
+              <w:bottom w:val="single" w:sz="5" w:color="D9D9D9"/>
+              <w:right w:val="single" w:sz="5" w:color="D9D9D9"/>
+            </w:tcBorders>
+            <w:shd w:fill="F3F3F3"/>
+            <w:tcMar>
+              <w:top w:w="95" w:type="dxa"/>
+              <w:left w:w="95" w:type="dxa"/>
+              <w:bottom w:w="95" w:type="dxa"/>
+              <w:right w:w="95" w:type="dxa"/>
+            </w:tcMar>
+          </w:tcPr>
+          <w:p>
+            <w:pPr>
+              <w:spacing w:after="60" w:before="60"/>
+            </w:pPr>
+            <w:r>
+              <w:rPr>
+                <w:b w:val="0"/>
+                <w:color w:val="000000"/>
+                <w:sz w:val="17"/>
+              </w:rPr>
+              <w:t>Sender and recipient; operator controls storage.</w:t>
+            </w:r>
+          </w:p>
+        </w:tc>
+        <w:tc>
+          <w:tcPr>
+            <w:tcW w:type="dxa" w:w="4680"/>
+            <w:vAlign w:val="center"/>
+            <w:tcBorders>
+              <w:top w:val="single" w:sz="5" w:color="D9D9D9"/>
+              <w:left w:val="single" w:sz="5" w:color="D9D9D9"/>
+              <w:bottom w:val="single" w:sz="5" w:color="D9D9D9"/>
+              <w:right w:val="single" w:sz="5" w:color="D9D9D9"/>
+            </w:tcBorders>
+            <w:shd w:fill="F3F3F3"/>
+            <w:tcMar>
+              <w:top w:w="95" w:type="dxa"/>
+              <w:left w:w="95" w:type="dxa"/>
+              <w:bottom w:w="95" w:type="dxa"/>
+              <w:right w:w="95" w:type="dxa"/>
+            </w:tcMar>
+          </w:tcPr>
+          <w:p>
+            <w:pPr>
+              <w:spacing w:after="60" w:before="60"/>
+            </w:pPr>
+            <w:r>
+              <w:rPr>
+                <w:b w:val="0"/>
+                <w:color w:val="000000"/>
+                <w:sz w:val="17"/>
+              </w:rPr>
+              <w:t>D3 messages. Restrict application access to participants; protect body confidentiality and recipient integrity.</w:t>
+            </w:r>
+          </w:p>
+        </w:tc>
+      </w:tr>
+      <w:tr>
+        <w:trPr>
+          <w:cantSplit/>
+        </w:trPr>
+        <w:tc>
+          <w:tcPr>
+            <w:tcW w:type="dxa" w:w="2160"/>
+            <w:vAlign w:val="center"/>
+            <w:tcBorders>
+              <w:top w:val="single" w:sz="5" w:color="D9D9D9"/>
+              <w:left w:val="single" w:sz="5" w:color="D9D9D9"/>
+              <w:bottom w:val="single" w:sz="5" w:color="D9D9D9"/>
+              <w:right w:val="single" w:sz="5" w:color="D9D9D9"/>
+            </w:tcBorders>
+            <w:shd w:fill="FFFFFF"/>
+            <w:tcMar>
+              <w:top w:w="95" w:type="dxa"/>
+              <w:left w:w="95" w:type="dxa"/>
+              <w:bottom w:w="95" w:type="dxa"/>
+              <w:right w:w="95" w:type="dxa"/>
+            </w:tcMar>
+          </w:tcPr>
+          <w:p>
+            <w:pPr>
+              <w:spacing w:after="60" w:before="60"/>
+            </w:pPr>
+            <w:r>
+              <w:rPr>
+                <w:b w:val="0"/>
+                <w:color w:val="000000"/>
+                <w:sz w:val="17"/>
+              </w:rPr>
+              <w:t>A4 Reports and recovery</w:t>
+            </w:r>
+          </w:p>
+        </w:tc>
+        <w:tc>
+          <w:tcPr>
+            <w:tcW w:type="dxa" w:w="2880"/>
+            <w:vAlign w:val="center"/>
+            <w:tcBorders>
+              <w:top w:val="single" w:sz="5" w:color="D9D9D9"/>
+              <w:left w:val="single" w:sz="5" w:color="D9D9D9"/>
+              <w:bottom w:val="single" w:sz="5" w:color="D9D9D9"/>
+              <w:right w:val="single" w:sz="5" w:color="D9D9D9"/>
+            </w:tcBorders>
+            <w:shd w:fill="FFFFFF"/>
+            <w:tcMar>
+              <w:top w:w="95" w:type="dxa"/>
+              <w:left w:w="95" w:type="dxa"/>
+              <w:bottom w:w="95" w:type="dxa"/>
+              <w:right w:w="95" w:type="dxa"/>
+            </w:tcMar>
+          </w:tcPr>
+          <w:p>
+            <w:pPr>
+              <w:spacing w:after="60" w:before="60"/>
+            </w:pPr>
+            <w:r>
+              <w:rPr>
+                <w:b w:val="0"/>
+                <w:color w:val="000000"/>
+                <w:sz w:val="17"/>
+              </w:rPr>
+              <w:t>Report creator; application enforces authority.</w:t>
+            </w:r>
+          </w:p>
+        </w:tc>
+        <w:tc>
+          <w:tcPr>
+            <w:tcW w:type="dxa" w:w="4680"/>
+            <w:vAlign w:val="center"/>
+            <w:tcBorders>
+              <w:top w:val="single" w:sz="5" w:color="D9D9D9"/>
+              <w:left w:val="single" w:sz="5" w:color="D9D9D9"/>
+              <w:bottom w:val="single" w:sz="5" w:color="D9D9D9"/>
+              <w:right w:val="single" w:sz="5" w:color="D9D9D9"/>
+            </w:tcBorders>
+            <w:shd w:fill="FFFFFF"/>
+            <w:tcMar>
+              <w:top w:w="95" w:type="dxa"/>
+              <w:left w:w="95" w:type="dxa"/>
+              <w:bottom w:w="95" w:type="dxa"/>
+              <w:right w:w="95" w:type="dxa"/>
+            </w:tcMar>
+          </w:tcPr>
+          <w:p>
+            <w:pPr>
+              <w:spacing w:after="60" w:before="60"/>
+            </w:pPr>
+            <w:r>
+              <w:rPr>
+                <w:b w:val="0"/>
+                <w:color w:val="000000"/>
+                <w:sz w:val="17"/>
+              </w:rPr>
+              <w:t>D2 reports. Preserve creator ownership and valid pending verified removed and recovered states.</w:t>
+            </w:r>
+          </w:p>
+        </w:tc>
+      </w:tr>
+      <w:tr>
+        <w:trPr>
+          <w:cantSplit/>
+        </w:trPr>
+        <w:tc>
+          <w:tcPr>
+            <w:tcW w:type="dxa" w:w="2160"/>
+            <w:vAlign w:val="center"/>
+            <w:tcBorders>
+              <w:top w:val="single" w:sz="5" w:color="D9D9D9"/>
+              <w:left w:val="single" w:sz="5" w:color="D9D9D9"/>
+              <w:bottom w:val="single" w:sz="5" w:color="D9D9D9"/>
+              <w:right w:val="single" w:sz="5" w:color="D9D9D9"/>
+            </w:tcBorders>
+            <w:shd w:fill="F3F3F3"/>
+            <w:tcMar>
+              <w:top w:w="95" w:type="dxa"/>
+              <w:left w:w="95" w:type="dxa"/>
+              <w:bottom w:w="95" w:type="dxa"/>
+              <w:right w:w="95" w:type="dxa"/>
+            </w:tcMar>
+          </w:tcPr>
+          <w:p>
+            <w:pPr>
+              <w:spacing w:after="60" w:before="60"/>
+            </w:pPr>
+            <w:r>
+              <w:rPr>
+                <w:b w:val="0"/>
+                <w:color w:val="000000"/>
+                <w:sz w:val="17"/>
+              </w:rPr>
+              <w:t>A5 Moderation decisions</w:t>
+            </w:r>
+          </w:p>
+        </w:tc>
+        <w:tc>
+          <w:tcPr>
+            <w:tcW w:type="dxa" w:w="2880"/>
+            <w:vAlign w:val="center"/>
+            <w:tcBorders>
+              <w:top w:val="single" w:sz="5" w:color="D9D9D9"/>
+              <w:left w:val="single" w:sz="5" w:color="D9D9D9"/>
+              <w:bottom w:val="single" w:sz="5" w:color="D9D9D9"/>
+              <w:right w:val="single" w:sz="5" w:color="D9D9D9"/>
+            </w:tcBorders>
+            <w:shd w:fill="F3F3F3"/>
+            <w:tcMar>
+              <w:top w:w="95" w:type="dxa"/>
+              <w:left w:w="95" w:type="dxa"/>
+              <w:bottom w:w="95" w:type="dxa"/>
+              <w:right w:w="95" w:type="dxa"/>
+            </w:tcMar>
+          </w:tcPr>
+          <w:p>
+            <w:pPr>
+              <w:spacing w:after="60" w:before="60"/>
+            </w:pPr>
+            <w:r>
+              <w:rPr>
+                <w:b w:val="0"/>
+                <w:color w:val="000000"/>
+                <w:sz w:val="17"/>
+              </w:rPr>
+              <w:t>Administrator; application records decisions.</w:t>
+            </w:r>
+          </w:p>
+        </w:tc>
+        <w:tc>
+          <w:tcPr>
+            <w:tcW w:type="dxa" w:w="4680"/>
+            <w:vAlign w:val="center"/>
+            <w:tcBorders>
+              <w:top w:val="single" w:sz="5" w:color="D9D9D9"/>
+              <w:left w:val="single" w:sz="5" w:color="D9D9D9"/>
+              <w:bottom w:val="single" w:sz="5" w:color="D9D9D9"/>
+              <w:right w:val="single" w:sz="5" w:color="D9D9D9"/>
+            </w:tcBorders>
+            <w:shd w:fill="F3F3F3"/>
+            <w:tcMar>
+              <w:top w:w="95" w:type="dxa"/>
+              <w:left w:w="95" w:type="dxa"/>
+              <w:bottom w:w="95" w:type="dxa"/>
+              <w:right w:w="95" w:type="dxa"/>
+            </w:tcMar>
+          </w:tcPr>
+          <w:p>
+            <w:pPr>
+              <w:spacing w:after="60" w:before="60"/>
+            </w:pPr>
+            <w:r>
+              <w:rPr>
+                <w:b w:val="0"/>
+                <w:color w:val="000000"/>
+                <w:sz w:val="17"/>
+              </w:rPr>
+              <w:t>D2 moderator reason and state. Prevent ordinary users from verifying or removing reports.</w:t>
+            </w:r>
+          </w:p>
+        </w:tc>
+      </w:tr>
+      <w:tr>
+        <w:trPr>
+          <w:cantSplit/>
+        </w:trPr>
+        <w:tc>
+          <w:tcPr>
+            <w:tcW w:type="dxa" w:w="2160"/>
+            <w:vAlign w:val="center"/>
+            <w:tcBorders>
+              <w:top w:val="single" w:sz="5" w:color="D9D9D9"/>
+              <w:left w:val="single" w:sz="5" w:color="D9D9D9"/>
+              <w:bottom w:val="single" w:sz="5" w:color="D9D9D9"/>
+              <w:right w:val="single" w:sz="5" w:color="D9D9D9"/>
+            </w:tcBorders>
+            <w:shd w:fill="FFFFFF"/>
+            <w:tcMar>
+              <w:top w:w="95" w:type="dxa"/>
+              <w:left w:w="95" w:type="dxa"/>
+              <w:bottom w:w="95" w:type="dxa"/>
+              <w:right w:w="95" w:type="dxa"/>
+            </w:tcMar>
+          </w:tcPr>
+          <w:p>
+            <w:pPr>
+              <w:spacing w:after="60" w:before="60"/>
+            </w:pPr>
+            <w:r>
+              <w:rPr>
+                <w:b w:val="0"/>
+                <w:color w:val="000000"/>
+                <w:sz w:val="17"/>
+              </w:rPr>
+              <w:t>A6 Audit metadata</w:t>
+            </w:r>
+          </w:p>
+        </w:tc>
+        <w:tc>
+          <w:tcPr>
+            <w:tcW w:type="dxa" w:w="2880"/>
+            <w:vAlign w:val="center"/>
+            <w:tcBorders>
+              <w:top w:val="single" w:sz="5" w:color="D9D9D9"/>
+              <w:left w:val="single" w:sz="5" w:color="D9D9D9"/>
+              <w:bottom w:val="single" w:sz="5" w:color="D9D9D9"/>
+              <w:right w:val="single" w:sz="5" w:color="D9D9D9"/>
+            </w:tcBorders>
+            <w:shd w:fill="FFFFFF"/>
+            <w:tcMar>
+              <w:top w:w="95" w:type="dxa"/>
+              <w:left w:w="95" w:type="dxa"/>
+              <w:bottom w:w="95" w:type="dxa"/>
+              <w:right w:w="95" w:type="dxa"/>
+            </w:tcMar>
+          </w:tcPr>
+          <w:p>
+            <w:pPr>
+              <w:spacing w:after="60" w:before="60"/>
+            </w:pPr>
+            <w:r>
+              <w:rPr>
+                <w:b w:val="0"/>
+                <w:color w:val="000000"/>
+                <w:sz w:val="17"/>
+              </w:rPr>
+              <w:t>Administrator reviewer; operator custodian.</w:t>
+            </w:r>
+          </w:p>
+        </w:tc>
+        <w:tc>
+          <w:tcPr>
+            <w:tcW w:type="dxa" w:w="4680"/>
+            <w:vAlign w:val="center"/>
+            <w:tcBorders>
+              <w:top w:val="single" w:sz="5" w:color="D9D9D9"/>
+              <w:left w:val="single" w:sz="5" w:color="D9D9D9"/>
+              <w:bottom w:val="single" w:sz="5" w:color="D9D9D9"/>
+              <w:right w:val="single" w:sz="5" w:color="D9D9D9"/>
+            </w:tcBorders>
+            <w:shd w:fill="FFFFFF"/>
+            <w:tcMar>
+              <w:top w:w="95" w:type="dxa"/>
+              <w:left w:w="95" w:type="dxa"/>
+              <w:bottom w:w="95" w:type="dxa"/>
+              <w:right w:w="95" w:type="dxa"/>
+            </w:tcMar>
+          </w:tcPr>
+          <w:p>
+            <w:pPr>
+              <w:spacing w:after="60" w:before="60"/>
+            </w:pPr>
+            <w:r>
+              <w:rPr>
+                <w:b w:val="0"/>
+                <w:color w:val="000000"/>
+                <w:sz w:val="17"/>
+              </w:rPr>
+              <w:t>D4 audit events. Preserve actor object outcome and time; exclude secrets and message bodies. External immutable retention is future work.</w:t>
+            </w:r>
+          </w:p>
+        </w:tc>
+      </w:tr>
+      <w:tr>
+        <w:trPr>
+          <w:cantSplit/>
+        </w:trPr>
+        <w:tc>
+          <w:tcPr>
+            <w:tcW w:type="dxa" w:w="2160"/>
+            <w:vAlign w:val="center"/>
+            <w:tcBorders>
+              <w:top w:val="single" w:sz="5" w:color="D9D9D9"/>
+              <w:left w:val="single" w:sz="5" w:color="D9D9D9"/>
+              <w:bottom w:val="single" w:sz="5" w:color="D9D9D9"/>
+              <w:right w:val="single" w:sz="5" w:color="D9D9D9"/>
+            </w:tcBorders>
+            <w:shd w:fill="F3F3F3"/>
+            <w:tcMar>
+              <w:top w:w="95" w:type="dxa"/>
+              <w:left w:w="95" w:type="dxa"/>
+              <w:bottom w:w="95" w:type="dxa"/>
+              <w:right w:w="95" w:type="dxa"/>
+            </w:tcMar>
+          </w:tcPr>
+          <w:p>
+            <w:pPr>
+              <w:spacing w:after="60" w:before="60"/>
+            </w:pPr>
+            <w:r>
+              <w:rPr>
+                <w:b w:val="0"/>
+                <w:color w:val="000000"/>
+                <w:sz w:val="17"/>
+              </w:rPr>
+              <w:t>A7 Session and CSRF authority</w:t>
+            </w:r>
+          </w:p>
+        </w:tc>
+        <w:tc>
+          <w:tcPr>
+            <w:tcW w:type="dxa" w:w="2880"/>
+            <w:vAlign w:val="center"/>
+            <w:tcBorders>
+              <w:top w:val="single" w:sz="5" w:color="D9D9D9"/>
+              <w:left w:val="single" w:sz="5" w:color="D9D9D9"/>
+              <w:bottom w:val="single" w:sz="5" w:color="D9D9D9"/>
+              <w:right w:val="single" w:sz="5" w:color="D9D9D9"/>
+            </w:tcBorders>
+            <w:shd w:fill="F3F3F3"/>
+            <w:tcMar>
+              <w:top w:w="95" w:type="dxa"/>
+              <w:left w:w="95" w:type="dxa"/>
+              <w:bottom w:w="95" w:type="dxa"/>
+              <w:right w:w="95" w:type="dxa"/>
+            </w:tcMar>
+          </w:tcPr>
+          <w:p>
+            <w:pPr>
+              <w:spacing w:after="60" w:before="60"/>
+            </w:pPr>
+            <w:r>
+              <w:rPr>
+                <w:b w:val="0"/>
+                <w:color w:val="000000"/>
+                <w:sz w:val="17"/>
+              </w:rPr>
+              <w:t>Operator manages signing secret; application issues sessions.</w:t>
+            </w:r>
+          </w:p>
+        </w:tc>
+        <w:tc>
+          <w:tcPr>
+            <w:tcW w:type="dxa" w:w="4680"/>
+            <w:vAlign w:val="center"/>
+            <w:tcBorders>
+              <w:top w:val="single" w:sz="5" w:color="D9D9D9"/>
+              <w:left w:val="single" w:sz="5" w:color="D9D9D9"/>
+              <w:bottom w:val="single" w:sz="5" w:color="D9D9D9"/>
+              <w:right w:val="single" w:sz="5" w:color="D9D9D9"/>
+            </w:tcBorders>
+            <w:shd w:fill="F3F3F3"/>
+            <w:tcMar>
+              <w:top w:w="95" w:type="dxa"/>
+              <w:left w:w="95" w:type="dxa"/>
+              <w:bottom w:w="95" w:type="dxa"/>
+              <w:right w:w="95" w:type="dxa"/>
+            </w:tcMar>
+          </w:tcPr>
+          <w:p>
+            <w:pPr>
+              <w:spacing w:after="60" w:before="60"/>
+            </w:pPr>
+            <w:r>
+              <w:rPr>
+                <w:b w:val="0"/>
+                <w:color w:val="000000"/>
+                <w:sz w:val="17"/>
+              </w:rPr>
+              <w:t>Runtime secret and browser session cookie. Prevent forgery and disclosure; derive authority from the current database user.</w:t>
+            </w:r>
+          </w:p>
+        </w:tc>
+      </w:tr>
+      <w:tr>
+        <w:trPr>
+          <w:cantSplit/>
+        </w:trPr>
+        <w:tc>
+          <w:tcPr>
+            <w:tcW w:type="dxa" w:w="2160"/>
+            <w:vAlign w:val="center"/>
+            <w:tcBorders>
+              <w:top w:val="single" w:sz="5" w:color="D9D9D9"/>
+              <w:left w:val="single" w:sz="5" w:color="D9D9D9"/>
+              <w:bottom w:val="single" w:sz="5" w:color="D9D9D9"/>
+              <w:right w:val="single" w:sz="5" w:color="D9D9D9"/>
+            </w:tcBorders>
+            <w:shd w:fill="FFFFFF"/>
+            <w:tcMar>
+              <w:top w:w="95" w:type="dxa"/>
+              <w:left w:w="95" w:type="dxa"/>
+              <w:bottom w:w="95" w:type="dxa"/>
+              <w:right w:w="95" w:type="dxa"/>
+            </w:tcMar>
+          </w:tcPr>
+          <w:p>
+            <w:pPr>
+              <w:spacing w:after="60" w:before="60"/>
+            </w:pPr>
+            <w:r>
+              <w:rPr>
+                <w:b w:val="0"/>
+                <w:color w:val="000000"/>
+                <w:sz w:val="17"/>
+              </w:rPr>
+              <w:t>A8 Private storage and backups</w:t>
+            </w:r>
+          </w:p>
+        </w:tc>
+        <w:tc>
+          <w:tcPr>
+            <w:tcW w:type="dxa" w:w="2880"/>
+            <w:vAlign w:val="center"/>
+            <w:tcBorders>
+              <w:top w:val="single" w:sz="5" w:color="D9D9D9"/>
+              <w:left w:val="single" w:sz="5" w:color="D9D9D9"/>
+              <w:bottom w:val="single" w:sz="5" w:color="D9D9D9"/>
+              <w:right w:val="single" w:sz="5" w:color="D9D9D9"/>
+            </w:tcBorders>
+            <w:shd w:fill="FFFFFF"/>
+            <w:tcMar>
+              <w:top w:w="95" w:type="dxa"/>
+              <w:left w:w="95" w:type="dxa"/>
+              <w:bottom w:w="95" w:type="dxa"/>
+              <w:right w:w="95" w:type="dxa"/>
+            </w:tcMar>
+          </w:tcPr>
+          <w:p>
+            <w:pPr>
+              <w:spacing w:after="60" w:before="60"/>
+            </w:pPr>
+            <w:r>
+              <w:rPr>
+                <w:b w:val="0"/>
+                <w:color w:val="000000"/>
+                <w:sz w:val="17"/>
+              </w:rPr>
+              <w:t>Operator.</w:t>
+            </w:r>
+          </w:p>
+        </w:tc>
+        <w:tc>
+          <w:tcPr>
+            <w:tcW w:type="dxa" w:w="4680"/>
+            <w:vAlign w:val="center"/>
+            <w:tcBorders>
+              <w:top w:val="single" w:sz="5" w:color="D9D9D9"/>
+              <w:left w:val="single" w:sz="5" w:color="D9D9D9"/>
+              <w:bottom w:val="single" w:sz="5" w:color="D9D9D9"/>
+              <w:right w:val="single" w:sz="5" w:color="D9D9D9"/>
+            </w:tcBorders>
+            <w:shd w:fill="FFFFFF"/>
+            <w:tcMar>
+              <w:top w:w="95" w:type="dxa"/>
+              <w:left w:w="95" w:type="dxa"/>
+              <w:bottom w:w="95" w:type="dxa"/>
+              <w:right w:w="95" w:type="dxa"/>
+            </w:tcMar>
+          </w:tcPr>
+          <w:p>
+            <w:pPr>
+              <w:spacing w:after="60" w:before="60"/>
+            </w:pPr>
+            <w:r>
+              <w:rPr>
+                <w:b w:val="0"/>
+                <w:color w:val="000000"/>
+                <w:sz w:val="17"/>
+              </w:rPr>
+              <w:t>Docker volume or Kubernetes PVC and controlled backups. Protect all stored data and restore availability; at-rest encryption is operational.</w:t>
+            </w:r>
+          </w:p>
+        </w:tc>
+      </w:tr>
+      <w:tr>
+        <w:trPr>
+          <w:cantSplit/>
+        </w:trPr>
+        <w:tc>
+          <w:tcPr>
+            <w:tcW w:type="dxa" w:w="2160"/>
+            <w:vAlign w:val="center"/>
+            <w:tcBorders>
+              <w:top w:val="single" w:sz="5" w:color="D9D9D9"/>
+              <w:left w:val="single" w:sz="5" w:color="D9D9D9"/>
+              <w:bottom w:val="single" w:sz="5" w:color="D9D9D9"/>
+              <w:right w:val="single" w:sz="5" w:color="D9D9D9"/>
+            </w:tcBorders>
+            <w:shd w:fill="F3F3F3"/>
+            <w:tcMar>
+              <w:top w:w="95" w:type="dxa"/>
+              <w:left w:w="95" w:type="dxa"/>
+              <w:bottom w:w="95" w:type="dxa"/>
+              <w:right w:w="95" w:type="dxa"/>
+            </w:tcMar>
+          </w:tcPr>
+          <w:p>
+            <w:pPr>
+              <w:spacing w:after="60" w:before="60"/>
+            </w:pPr>
+            <w:r>
+              <w:rPr>
+                <w:b w:val="0"/>
+                <w:color w:val="000000"/>
+                <w:sz w:val="17"/>
+              </w:rPr>
+              <w:t>A9 Build and dependencies</w:t>
+            </w:r>
+          </w:p>
+        </w:tc>
+        <w:tc>
+          <w:tcPr>
+            <w:tcW w:type="dxa" w:w="2880"/>
+            <w:vAlign w:val="center"/>
+            <w:tcBorders>
+              <w:top w:val="single" w:sz="5" w:color="D9D9D9"/>
+              <w:left w:val="single" w:sz="5" w:color="D9D9D9"/>
+              <w:bottom w:val="single" w:sz="5" w:color="D9D9D9"/>
+              <w:right w:val="single" w:sz="5" w:color="D9D9D9"/>
+            </w:tcBorders>
+            <w:shd w:fill="F3F3F3"/>
+            <w:tcMar>
+              <w:top w:w="95" w:type="dxa"/>
+              <w:left w:w="95" w:type="dxa"/>
+              <w:bottom w:w="95" w:type="dxa"/>
+              <w:right w:w="95" w:type="dxa"/>
+            </w:tcMar>
+          </w:tcPr>
+          <w:p>
+            <w:pPr>
+              <w:spacing w:after="60" w:before="60"/>
+            </w:pPr>
+            <w:r>
+              <w:rPr>
+                <w:b w:val="0"/>
+                <w:color w:val="000000"/>
+                <w:sz w:val="17"/>
+              </w:rPr>
+              <w:t>Developer and deployment operator.</w:t>
+            </w:r>
+          </w:p>
+        </w:tc>
+        <w:tc>
+          <w:tcPr>
+            <w:tcW w:type="dxa" w:w="4680"/>
+            <w:vAlign w:val="center"/>
+            <w:tcBorders>
+              <w:top w:val="single" w:sz="5" w:color="D9D9D9"/>
+              <w:left w:val="single" w:sz="5" w:color="D9D9D9"/>
+              <w:bottom w:val="single" w:sz="5" w:color="D9D9D9"/>
+              <w:right w:val="single" w:sz="5" w:color="D9D9D9"/>
+            </w:tcBorders>
+            <w:shd w:fill="F3F3F3"/>
+            <w:tcMar>
+              <w:top w:w="95" w:type="dxa"/>
+              <w:left w:w="95" w:type="dxa"/>
+              <w:bottom w:w="95" w:type="dxa"/>
+              <w:right w:w="95" w:type="dxa"/>
+            </w:tcMar>
+          </w:tcPr>
+          <w:p>
+            <w:pPr>
+              <w:spacing w:after="60" w:before="60"/>
+            </w:pPr>
+            <w:r>
+              <w:rPr>
+                <w:b w:val="0"/>
+                <w:color w:val="000000"/>
+                <w:sz w:val="17"/>
+              </w:rPr>
+              <w:t>Pinned requirements container image and CI configuration. Preserve dependency and executable integrity before deployment.</w:t>
+            </w:r>
+          </w:p>
+        </w:tc>
+      </w:tr>
+    </w:tbl>
+    <w:p>
+      <w:pPr>
+        <w:spacing w:after="20" w:line="20" w:lineRule="exact"/>
+      </w:pPr>
+      <w:r>
+        <w:rPr>
+          <w:sz w:val="2"/>
+        </w:rPr>
+      </w:r>
+    </w:p>
+    <w:p>
+      <w:pPr>
+        <w:pStyle w:val="Heading2"/>
+      </w:pPr>
+      <w:r>
+        <w:t>Trust Boundaries</w:t>
+      </w:r>
+    </w:p>
+    <w:p>
+      <w:pPr>
+        <w:keepLines/>
+      </w:pPr>
+      <w:r>
+        <w:t>A trust boundary marks a change in who controls an input or which privileges may be used. Crossing a boundary never grants authority automatically. TB1–TB3 below match the DFD and attack-tree references; each crossing must apply the listed validation and access controls.</w:t>
+      </w:r>
+    </w:p>
+    <w:tbl>
+      <w:tblPr>
+        <w:tblW w:type="auto" w:w="0"/>
+        <w:tblLayout w:type="fixed"/>
+        <w:tblLook w:firstColumn="1" w:firstRow="1" w:lastColumn="0" w:lastRow="0" w:noHBand="0" w:noVBand="1" w:val="04A0"/>
+      </w:tblPr>
+      <w:tblGrid>
+        <w:gridCol w:w="648"/>
+        <w:gridCol w:w="1512"/>
+        <w:gridCol w:w="1728"/>
+        <w:gridCol w:w="1584"/>
+        <w:gridCol w:w="3240"/>
+        <w:gridCol w:w="1008"/>
+      </w:tblGrid>
+      <w:tr>
+        <w:trPr>
+          <w:tblHeader/>
+          <w:cantSplit/>
+        </w:trPr>
+        <w:tc>
+          <w:tcPr>
+            <w:tcW w:type="dxa" w:w="648"/>
+            <w:vAlign w:val="center"/>
+            <w:tcBorders>
+              <w:top w:val="single" w:sz="5" w:color="D9D9D9"/>
+              <w:left w:val="single" w:sz="5" w:color="D9D9D9"/>
+              <w:bottom w:val="single" w:sz="5" w:color="D9D9D9"/>
+              <w:right w:val="single" w:sz="5" w:color="D9D9D9"/>
+            </w:tcBorders>
+            <w:shd w:fill="333333"/>
+            <w:tcMar>
+              <w:top w:w="95" w:type="dxa"/>
+              <w:left w:w="95" w:type="dxa"/>
+              <w:bottom w:w="95" w:type="dxa"/>
+              <w:right w:w="95" w:type="dxa"/>
+            </w:tcMar>
+          </w:tcPr>
+          <w:p>
+            <w:pPr>
+              <w:spacing w:after="60" w:before="60"/>
+            </w:pPr>
+            <w:r>
+              <w:rPr>
+                <w:b/>
+                <w:color w:val="FFFFFF"/>
+                <w:sz w:val="17"/>
+              </w:rPr>
+              <w:t>ID</w:t>
+            </w:r>
+          </w:p>
+        </w:tc>
+        <w:tc>
+          <w:tcPr>
+            <w:tcW w:type="dxa" w:w="1512"/>
+            <w:vAlign w:val="center"/>
+            <w:tcBorders>
+              <w:top w:val="single" w:sz="5" w:color="D9D9D9"/>
+              <w:left w:val="single" w:sz="5" w:color="D9D9D9"/>
+              <w:bottom w:val="single" w:sz="5" w:color="D9D9D9"/>
+              <w:right w:val="single" w:sz="5" w:color="D9D9D9"/>
+            </w:tcBorders>
+            <w:shd w:fill="333333"/>
+            <w:tcMar>
+              <w:top w:w="95" w:type="dxa"/>
+              <w:left w:w="95" w:type="dxa"/>
+              <w:bottom w:w="95" w:type="dxa"/>
+              <w:right w:w="95" w:type="dxa"/>
+            </w:tcMar>
+          </w:tcPr>
+          <w:p>
+            <w:pPr>
+              <w:spacing w:after="60" w:before="60"/>
+            </w:pPr>
+            <w:r>
+              <w:rPr>
+                <w:b/>
+                <w:color w:val="FFFFFF"/>
+                <w:sz w:val="17"/>
+              </w:rPr>
+              <w:t>Boundary</w:t>
+            </w:r>
+          </w:p>
+        </w:tc>
+        <w:tc>
+          <w:tcPr>
+            <w:tcW w:type="dxa" w:w="1728"/>
+            <w:vAlign w:val="center"/>
+            <w:tcBorders>
+              <w:top w:val="single" w:sz="5" w:color="D9D9D9"/>
+              <w:left w:val="single" w:sz="5" w:color="D9D9D9"/>
+              <w:bottom w:val="single" w:sz="5" w:color="D9D9D9"/>
+              <w:right w:val="single" w:sz="5" w:color="D9D9D9"/>
+            </w:tcBorders>
+            <w:shd w:fill="333333"/>
+            <w:tcMar>
+              <w:top w:w="95" w:type="dxa"/>
+              <w:left w:w="95" w:type="dxa"/>
+              <w:bottom w:w="95" w:type="dxa"/>
+              <w:right w:w="95" w:type="dxa"/>
+            </w:tcMar>
+          </w:tcPr>
+          <w:p>
+            <w:pPr>
+              <w:spacing w:after="60" w:before="60"/>
+            </w:pPr>
+            <w:r>
+              <w:rPr>
+                <w:b/>
+                <w:color w:val="FFFFFF"/>
+                <w:sz w:val="17"/>
+              </w:rPr>
+              <w:t>Trust change</w:t>
+            </w:r>
+          </w:p>
+        </w:tc>
+        <w:tc>
+          <w:tcPr>
+            <w:tcW w:type="dxa" w:w="1584"/>
+            <w:vAlign w:val="center"/>
+            <w:tcBorders>
+              <w:top w:val="single" w:sz="5" w:color="D9D9D9"/>
+              <w:left w:val="single" w:sz="5" w:color="D9D9D9"/>
+              <w:bottom w:val="single" w:sz="5" w:color="D9D9D9"/>
+              <w:right w:val="single" w:sz="5" w:color="D9D9D9"/>
+            </w:tcBorders>
+            <w:shd w:fill="333333"/>
+            <w:tcMar>
+              <w:top w:w="95" w:type="dxa"/>
+              <w:left w:w="95" w:type="dxa"/>
+              <w:bottom w:w="95" w:type="dxa"/>
+              <w:right w:w="95" w:type="dxa"/>
+            </w:tcMar>
+          </w:tcPr>
+          <w:p>
+            <w:pPr>
+              <w:spacing w:after="60" w:before="60"/>
+            </w:pPr>
+            <w:r>
+              <w:rPr>
+                <w:b/>
+                <w:color w:val="FFFFFF"/>
+                <w:sz w:val="17"/>
+              </w:rPr>
+              <w:t>Crossing data or authority</w:t>
+            </w:r>
+          </w:p>
+        </w:tc>
+        <w:tc>
+          <w:tcPr>
+            <w:tcW w:type="dxa" w:w="3240"/>
+            <w:vAlign w:val="center"/>
+            <w:tcBorders>
+              <w:top w:val="single" w:sz="5" w:color="D9D9D9"/>
+              <w:left w:val="single" w:sz="5" w:color="D9D9D9"/>
+              <w:bottom w:val="single" w:sz="5" w:color="D9D9D9"/>
+              <w:right w:val="single" w:sz="5" w:color="D9D9D9"/>
+            </w:tcBorders>
+            <w:shd w:fill="333333"/>
+            <w:tcMar>
+              <w:top w:w="95" w:type="dxa"/>
+              <w:left w:w="95" w:type="dxa"/>
+              <w:bottom w:w="95" w:type="dxa"/>
+              <w:right w:w="95" w:type="dxa"/>
+            </w:tcMar>
+          </w:tcPr>
+          <w:p>
+            <w:pPr>
+              <w:spacing w:after="60" w:before="60"/>
+            </w:pPr>
+            <w:r>
+              <w:rPr>
+                <w:b/>
+                <w:color w:val="FFFFFF"/>
+                <w:sz w:val="17"/>
+              </w:rPr>
+              <w:t>Controls and limits</w:t>
+            </w:r>
+          </w:p>
+        </w:tc>
+        <w:tc>
+          <w:tcPr>
+            <w:tcW w:type="dxa" w:w="1008"/>
+            <w:vAlign w:val="center"/>
+            <w:tcBorders>
+              <w:top w:val="single" w:sz="5" w:color="D9D9D9"/>
+              <w:left w:val="single" w:sz="5" w:color="D9D9D9"/>
+              <w:bottom w:val="single" w:sz="5" w:color="D9D9D9"/>
+              <w:right w:val="single" w:sz="5" w:color="D9D9D9"/>
+            </w:tcBorders>
+            <w:shd w:fill="333333"/>
+            <w:tcMar>
+              <w:top w:w="95" w:type="dxa"/>
+              <w:left w:w="95" w:type="dxa"/>
+              <w:bottom w:w="95" w:type="dxa"/>
+              <w:right w:w="95" w:type="dxa"/>
+            </w:tcMar>
+          </w:tcPr>
+          <w:p>
+            <w:pPr>
+              <w:spacing w:after="60" w:before="60"/>
+            </w:pPr>
+            <w:r>
+              <w:rPr>
+                <w:b/>
+                <w:color w:val="FFFFFF"/>
+                <w:sz w:val="17"/>
+              </w:rPr>
+              <w:t>Threat trace</w:t>
+            </w:r>
+          </w:p>
+        </w:tc>
+      </w:tr>
+      <w:tr>
+        <w:trPr>
+          <w:cantSplit/>
+        </w:trPr>
+        <w:tc>
+          <w:tcPr>
+            <w:tcW w:type="dxa" w:w="648"/>
+            <w:vAlign w:val="center"/>
+            <w:tcBorders>
+              <w:top w:val="single" w:sz="5" w:color="D9D9D9"/>
+              <w:left w:val="single" w:sz="5" w:color="D9D9D9"/>
+              <w:bottom w:val="single" w:sz="5" w:color="D9D9D9"/>
+              <w:right w:val="single" w:sz="5" w:color="D9D9D9"/>
+            </w:tcBorders>
+            <w:shd w:fill="FFFFFF"/>
+            <w:tcMar>
+              <w:top w:w="95" w:type="dxa"/>
+              <w:left w:w="95" w:type="dxa"/>
+              <w:bottom w:w="95" w:type="dxa"/>
+              <w:right w:w="95" w:type="dxa"/>
+            </w:tcMar>
+          </w:tcPr>
+          <w:p>
+            <w:pPr>
+              <w:spacing w:after="60" w:before="60"/>
+            </w:pPr>
+            <w:r>
+              <w:rPr>
+                <w:b w:val="0"/>
+                <w:color w:val="000000"/>
+                <w:sz w:val="17"/>
+              </w:rPr>
+              <w:t>TB1</w:t>
+            </w:r>
+          </w:p>
+        </w:tc>
+        <w:tc>
+          <w:tcPr>
+            <w:tcW w:type="dxa" w:w="1512"/>
+            <w:vAlign w:val="center"/>
+            <w:tcBorders>
+              <w:top w:val="single" w:sz="5" w:color="D9D9D9"/>
+              <w:left w:val="single" w:sz="5" w:color="D9D9D9"/>
+              <w:bottom w:val="single" w:sz="5" w:color="D9D9D9"/>
+              <w:right w:val="single" w:sz="5" w:color="D9D9D9"/>
+            </w:tcBorders>
+            <w:shd w:fill="FFFFFF"/>
+            <w:tcMar>
+              <w:top w:w="95" w:type="dxa"/>
+              <w:left w:w="95" w:type="dxa"/>
+              <w:bottom w:w="95" w:type="dxa"/>
+              <w:right w:w="95" w:type="dxa"/>
+            </w:tcMar>
+          </w:tcPr>
+          <w:p>
+            <w:pPr>
+              <w:spacing w:after="60" w:before="60"/>
+            </w:pPr>
+            <w:r>
+              <w:rPr>
+                <w:b w:val="0"/>
+                <w:color w:val="000000"/>
+                <w:sz w:val="17"/>
+              </w:rPr>
+              <w:t>Browser to application</w:t>
+            </w:r>
+          </w:p>
+        </w:tc>
+        <w:tc>
+          <w:tcPr>
+            <w:tcW w:type="dxa" w:w="1728"/>
+            <w:vAlign w:val="center"/>
+            <w:tcBorders>
+              <w:top w:val="single" w:sz="5" w:color="D9D9D9"/>
+              <w:left w:val="single" w:sz="5" w:color="D9D9D9"/>
+              <w:bottom w:val="single" w:sz="5" w:color="D9D9D9"/>
+              <w:right w:val="single" w:sz="5" w:color="D9D9D9"/>
+            </w:tcBorders>
+            <w:shd w:fill="FFFFFF"/>
+            <w:tcMar>
+              <w:top w:w="95" w:type="dxa"/>
+              <w:left w:w="95" w:type="dxa"/>
+              <w:bottom w:w="95" w:type="dxa"/>
+              <w:right w:w="95" w:type="dxa"/>
+            </w:tcMar>
+          </w:tcPr>
+          <w:p>
+            <w:pPr>
+              <w:spacing w:after="60" w:before="60"/>
+            </w:pPr>
+            <w:r>
+              <w:rPr>
+                <w:b w:val="0"/>
+                <w:color w:val="000000"/>
+                <w:sz w:val="17"/>
+              </w:rPr>
+              <w:t>Untrusted caller and submitted text cross into server processing through the HTTPS deployment edge.</w:t>
+            </w:r>
+          </w:p>
+        </w:tc>
+        <w:tc>
+          <w:tcPr>
+            <w:tcW w:type="dxa" w:w="1584"/>
+            <w:vAlign w:val="center"/>
+            <w:tcBorders>
+              <w:top w:val="single" w:sz="5" w:color="D9D9D9"/>
+              <w:left w:val="single" w:sz="5" w:color="D9D9D9"/>
+              <w:bottom w:val="single" w:sz="5" w:color="D9D9D9"/>
+              <w:right w:val="single" w:sz="5" w:color="D9D9D9"/>
+            </w:tcBorders>
+            <w:shd w:fill="FFFFFF"/>
+            <w:tcMar>
+              <w:top w:w="95" w:type="dxa"/>
+              <w:left w:w="95" w:type="dxa"/>
+              <w:bottom w:w="95" w:type="dxa"/>
+              <w:right w:w="95" w:type="dxa"/>
+            </w:tcMar>
+          </w:tcPr>
+          <w:p>
+            <w:pPr>
+              <w:spacing w:after="60" w:before="60"/>
+            </w:pPr>
+            <w:r>
+              <w:rPr>
+                <w:b w:val="0"/>
+                <w:color w:val="000000"/>
+                <w:sz w:val="17"/>
+              </w:rPr>
+              <w:t>Credentials reports messages search and state-changing forms.</w:t>
+            </w:r>
+          </w:p>
+        </w:tc>
+        <w:tc>
+          <w:tcPr>
+            <w:tcW w:type="dxa" w:w="3240"/>
+            <w:vAlign w:val="center"/>
+            <w:tcBorders>
+              <w:top w:val="single" w:sz="5" w:color="D9D9D9"/>
+              <w:left w:val="single" w:sz="5" w:color="D9D9D9"/>
+              <w:bottom w:val="single" w:sz="5" w:color="D9D9D9"/>
+              <w:right w:val="single" w:sz="5" w:color="D9D9D9"/>
+            </w:tcBorders>
+            <w:shd w:fill="FFFFFF"/>
+            <w:tcMar>
+              <w:top w:w="95" w:type="dxa"/>
+              <w:left w:w="95" w:type="dxa"/>
+              <w:bottom w:w="95" w:type="dxa"/>
+              <w:right w:w="95" w:type="dxa"/>
+            </w:tcMar>
+          </w:tcPr>
+          <w:p>
+            <w:pPr>
+              <w:spacing w:after="60" w:before="60"/>
+            </w:pPr>
+            <w:r>
+              <w:rPr>
+                <w:b w:val="0"/>
+                <w:color w:val="000000"/>
+                <w:sz w:val="17"/>
+              </w:rPr>
+              <w:t>TLS at Caddy; authenticate current user; enforce role ownership and participant policies; session-bound CSRF; allowlisted bounded input; escaped output. Caddy-to-application HTTP stays inside the controlled deployment network or pod.</w:t>
+            </w:r>
+          </w:p>
+        </w:tc>
+        <w:tc>
+          <w:tcPr>
+            <w:tcW w:type="dxa" w:w="1008"/>
+            <w:vAlign w:val="center"/>
+            <w:tcBorders>
+              <w:top w:val="single" w:sz="5" w:color="D9D9D9"/>
+              <w:left w:val="single" w:sz="5" w:color="D9D9D9"/>
+              <w:bottom w:val="single" w:sz="5" w:color="D9D9D9"/>
+              <w:right w:val="single" w:sz="5" w:color="D9D9D9"/>
+            </w:tcBorders>
+            <w:shd w:fill="FFFFFF"/>
+            <w:tcMar>
+              <w:top w:w="95" w:type="dxa"/>
+              <w:left w:w="95" w:type="dxa"/>
+              <w:bottom w:w="95" w:type="dxa"/>
+              <w:right w:w="95" w:type="dxa"/>
+            </w:tcMar>
+          </w:tcPr>
+          <w:p>
+            <w:pPr>
+              <w:spacing w:after="60" w:before="60"/>
+            </w:pPr>
+            <w:r>
+              <w:rPr>
+                <w:b w:val="0"/>
+                <w:color w:val="000000"/>
+                <w:sz w:val="17"/>
+              </w:rPr>
+              <w:t>TH01 TH03 TH04 TH05 TH06 TH07 TH08 TH12</w:t>
+            </w:r>
+          </w:p>
+        </w:tc>
+      </w:tr>
+      <w:tr>
+        <w:trPr>
+          <w:cantSplit/>
+        </w:trPr>
+        <w:tc>
+          <w:tcPr>
+            <w:tcW w:type="dxa" w:w="648"/>
+            <w:vAlign w:val="center"/>
+            <w:tcBorders>
+              <w:top w:val="single" w:sz="5" w:color="D9D9D9"/>
+              <w:left w:val="single" w:sz="5" w:color="D9D9D9"/>
+              <w:bottom w:val="single" w:sz="5" w:color="D9D9D9"/>
+              <w:right w:val="single" w:sz="5" w:color="D9D9D9"/>
+            </w:tcBorders>
+            <w:shd w:fill="F3F3F3"/>
+            <w:tcMar>
+              <w:top w:w="95" w:type="dxa"/>
+              <w:left w:w="95" w:type="dxa"/>
+              <w:bottom w:w="95" w:type="dxa"/>
+              <w:right w:w="95" w:type="dxa"/>
+            </w:tcMar>
+          </w:tcPr>
+          <w:p>
+            <w:pPr>
+              <w:spacing w:after="60" w:before="60"/>
+            </w:pPr>
+            <w:r>
+              <w:rPr>
+                <w:b w:val="0"/>
+                <w:color w:val="000000"/>
+                <w:sz w:val="17"/>
+              </w:rPr>
+              <w:t>TB2</w:t>
+            </w:r>
+          </w:p>
+        </w:tc>
+        <w:tc>
+          <w:tcPr>
+            <w:tcW w:type="dxa" w:w="1512"/>
+            <w:vAlign w:val="center"/>
+            <w:tcBorders>
+              <w:top w:val="single" w:sz="5" w:color="D9D9D9"/>
+              <w:left w:val="single" w:sz="5" w:color="D9D9D9"/>
+              <w:bottom w:val="single" w:sz="5" w:color="D9D9D9"/>
+              <w:right w:val="single" w:sz="5" w:color="D9D9D9"/>
+            </w:tcBorders>
+            <w:shd w:fill="F3F3F3"/>
+            <w:tcMar>
+              <w:top w:w="95" w:type="dxa"/>
+              <w:left w:w="95" w:type="dxa"/>
+              <w:bottom w:w="95" w:type="dxa"/>
+              <w:right w:w="95" w:type="dxa"/>
+            </w:tcMar>
+          </w:tcPr>
+          <w:p>
+            <w:pPr>
+              <w:spacing w:after="60" w:before="60"/>
+            </w:pPr>
+            <w:r>
+              <w:rPr>
+                <w:b w:val="0"/>
+                <w:color w:val="000000"/>
+                <w:sz w:val="17"/>
+              </w:rPr>
+              <w:t>Application to private storage</w:t>
+            </w:r>
+          </w:p>
+        </w:tc>
+        <w:tc>
+          <w:tcPr>
+            <w:tcW w:type="dxa" w:w="1728"/>
+            <w:vAlign w:val="center"/>
+            <w:tcBorders>
+              <w:top w:val="single" w:sz="5" w:color="D9D9D9"/>
+              <w:left w:val="single" w:sz="5" w:color="D9D9D9"/>
+              <w:bottom w:val="single" w:sz="5" w:color="D9D9D9"/>
+              <w:right w:val="single" w:sz="5" w:color="D9D9D9"/>
+            </w:tcBorders>
+            <w:shd w:fill="F3F3F3"/>
+            <w:tcMar>
+              <w:top w:w="95" w:type="dxa"/>
+              <w:left w:w="95" w:type="dxa"/>
+              <w:bottom w:w="95" w:type="dxa"/>
+              <w:right w:w="95" w:type="dxa"/>
+            </w:tcMar>
+          </w:tcPr>
+          <w:p>
+            <w:pPr>
+              <w:spacing w:after="60" w:before="60"/>
+            </w:pPr>
+            <w:r>
+              <w:rPr>
+                <w:b w:val="0"/>
+                <w:color w:val="000000"/>
+                <w:sz w:val="17"/>
+              </w:rPr>
+              <w:t>Server route authority crosses into persistent records; the database is not exposed to browsers.</w:t>
+            </w:r>
+          </w:p>
+        </w:tc>
+        <w:tc>
+          <w:tcPr>
+            <w:tcW w:type="dxa" w:w="1584"/>
+            <w:vAlign w:val="center"/>
+            <w:tcBorders>
+              <w:top w:val="single" w:sz="5" w:color="D9D9D9"/>
+              <w:left w:val="single" w:sz="5" w:color="D9D9D9"/>
+              <w:bottom w:val="single" w:sz="5" w:color="D9D9D9"/>
+              <w:right w:val="single" w:sz="5" w:color="D9D9D9"/>
+            </w:tcBorders>
+            <w:shd w:fill="F3F3F3"/>
+            <w:tcMar>
+              <w:top w:w="95" w:type="dxa"/>
+              <w:left w:w="95" w:type="dxa"/>
+              <w:bottom w:w="95" w:type="dxa"/>
+              <w:right w:w="95" w:type="dxa"/>
+            </w:tcMar>
+          </w:tcPr>
+          <w:p>
+            <w:pPr>
+              <w:spacing w:after="60" w:before="60"/>
+            </w:pPr>
+            <w:r>
+              <w:rPr>
+                <w:b w:val="0"/>
+                <w:color w:val="000000"/>
+                <w:sz w:val="17"/>
+              </w:rPr>
+              <w:t>D1 credentials D2 reports D3 messages D4 audit and login-attempt records.</w:t>
+            </w:r>
+          </w:p>
+        </w:tc>
+        <w:tc>
+          <w:tcPr>
+            <w:tcW w:type="dxa" w:w="3240"/>
+            <w:vAlign w:val="center"/>
+            <w:tcBorders>
+              <w:top w:val="single" w:sz="5" w:color="D9D9D9"/>
+              <w:left w:val="single" w:sz="5" w:color="D9D9D9"/>
+              <w:bottom w:val="single" w:sz="5" w:color="D9D9D9"/>
+              <w:right w:val="single" w:sz="5" w:color="D9D9D9"/>
+            </w:tcBorders>
+            <w:shd w:fill="F3F3F3"/>
+            <w:tcMar>
+              <w:top w:w="95" w:type="dxa"/>
+              <w:left w:w="95" w:type="dxa"/>
+              <w:bottom w:w="95" w:type="dxa"/>
+              <w:right w:w="95" w:type="dxa"/>
+            </w:tcMar>
+          </w:tcPr>
+          <w:p>
+            <w:pPr>
+              <w:spacing w:after="60" w:before="60"/>
+            </w:pPr>
+            <w:r>
+              <w:rPr>
+                <w:b w:val="0"/>
+                <w:color w:val="000000"/>
+                <w:sz w:val="17"/>
+              </w:rPr>
+              <w:t>Parameterized SQL; participant and owner predicates; foreign keys and state checks; non-root process and operator storage ACL. At-rest encryption and backup protection remain operator responsibilities.</w:t>
+            </w:r>
+          </w:p>
+        </w:tc>
+        <w:tc>
+          <w:tcPr>
+            <w:tcW w:type="dxa" w:w="1008"/>
+            <w:vAlign w:val="center"/>
+            <w:tcBorders>
+              <w:top w:val="single" w:sz="5" w:color="D9D9D9"/>
+              <w:left w:val="single" w:sz="5" w:color="D9D9D9"/>
+              <w:bottom w:val="single" w:sz="5" w:color="D9D9D9"/>
+              <w:right w:val="single" w:sz="5" w:color="D9D9D9"/>
+            </w:tcBorders>
+            <w:shd w:fill="F3F3F3"/>
+            <w:tcMar>
+              <w:top w:w="95" w:type="dxa"/>
+              <w:left w:w="95" w:type="dxa"/>
+              <w:bottom w:w="95" w:type="dxa"/>
+              <w:right w:w="95" w:type="dxa"/>
+            </w:tcMar>
+          </w:tcPr>
+          <w:p>
+            <w:pPr>
+              <w:spacing w:after="60" w:before="60"/>
+            </w:pPr>
+            <w:r>
+              <w:rPr>
+                <w:b w:val="0"/>
+                <w:color w:val="000000"/>
+                <w:sz w:val="17"/>
+              </w:rPr>
+              <w:t>TH02 TH03 TH05 TH09 TH10</w:t>
+            </w:r>
+          </w:p>
+        </w:tc>
+      </w:tr>
+      <w:tr>
+        <w:trPr>
+          <w:cantSplit/>
+        </w:trPr>
+        <w:tc>
+          <w:tcPr>
+            <w:tcW w:type="dxa" w:w="648"/>
+            <w:vAlign w:val="center"/>
+            <w:tcBorders>
+              <w:top w:val="single" w:sz="5" w:color="D9D9D9"/>
+              <w:left w:val="single" w:sz="5" w:color="D9D9D9"/>
+              <w:bottom w:val="single" w:sz="5" w:color="D9D9D9"/>
+              <w:right w:val="single" w:sz="5" w:color="D9D9D9"/>
+            </w:tcBorders>
+            <w:shd w:fill="FFFFFF"/>
+            <w:tcMar>
+              <w:top w:w="95" w:type="dxa"/>
+              <w:left w:w="95" w:type="dxa"/>
+              <w:bottom w:w="95" w:type="dxa"/>
+              <w:right w:w="95" w:type="dxa"/>
+            </w:tcMar>
+          </w:tcPr>
+          <w:p>
+            <w:pPr>
+              <w:spacing w:after="60" w:before="60"/>
+            </w:pPr>
+            <w:r>
+              <w:rPr>
+                <w:b w:val="0"/>
+                <w:color w:val="000000"/>
+                <w:sz w:val="17"/>
+              </w:rPr>
+              <w:t>TB3</w:t>
+            </w:r>
+          </w:p>
+        </w:tc>
+        <w:tc>
+          <w:tcPr>
+            <w:tcW w:type="dxa" w:w="1512"/>
+            <w:vAlign w:val="center"/>
+            <w:tcBorders>
+              <w:top w:val="single" w:sz="5" w:color="D9D9D9"/>
+              <w:left w:val="single" w:sz="5" w:color="D9D9D9"/>
+              <w:bottom w:val="single" w:sz="5" w:color="D9D9D9"/>
+              <w:right w:val="single" w:sz="5" w:color="D9D9D9"/>
+            </w:tcBorders>
+            <w:shd w:fill="FFFFFF"/>
+            <w:tcMar>
+              <w:top w:w="95" w:type="dxa"/>
+              <w:left w:w="95" w:type="dxa"/>
+              <w:bottom w:w="95" w:type="dxa"/>
+              <w:right w:w="95" w:type="dxa"/>
+            </w:tcMar>
+          </w:tcPr>
+          <w:p>
+            <w:pPr>
+              <w:spacing w:after="60" w:before="60"/>
+            </w:pPr>
+            <w:r>
+              <w:rPr>
+                <w:b w:val="0"/>
+                <w:color w:val="000000"/>
+                <w:sz w:val="17"/>
+              </w:rPr>
+              <w:t>Operator to deployment and secrets</w:t>
+            </w:r>
+          </w:p>
+        </w:tc>
+        <w:tc>
+          <w:tcPr>
+            <w:tcW w:type="dxa" w:w="1728"/>
+            <w:vAlign w:val="center"/>
+            <w:tcBorders>
+              <w:top w:val="single" w:sz="5" w:color="D9D9D9"/>
+              <w:left w:val="single" w:sz="5" w:color="D9D9D9"/>
+              <w:bottom w:val="single" w:sz="5" w:color="D9D9D9"/>
+              <w:right w:val="single" w:sz="5" w:color="D9D9D9"/>
+            </w:tcBorders>
+            <w:shd w:fill="FFFFFF"/>
+            <w:tcMar>
+              <w:top w:w="95" w:type="dxa"/>
+              <w:left w:w="95" w:type="dxa"/>
+              <w:bottom w:w="95" w:type="dxa"/>
+              <w:right w:w="95" w:type="dxa"/>
+            </w:tcMar>
+          </w:tcPr>
+          <w:p>
+            <w:pPr>
+              <w:spacing w:after="60" w:before="60"/>
+            </w:pPr>
+            <w:r>
+              <w:rPr>
+                <w:b w:val="0"/>
+                <w:color w:val="000000"/>
+                <w:sz w:val="17"/>
+              </w:rPr>
+              <w:t>Privileged provisioning build and deployment actions cross into the application runtime and its storage.</w:t>
+            </w:r>
+          </w:p>
+        </w:tc>
+        <w:tc>
+          <w:tcPr>
+            <w:tcW w:type="dxa" w:w="1584"/>
+            <w:vAlign w:val="center"/>
+            <w:tcBorders>
+              <w:top w:val="single" w:sz="5" w:color="D9D9D9"/>
+              <w:left w:val="single" w:sz="5" w:color="D9D9D9"/>
+              <w:bottom w:val="single" w:sz="5" w:color="D9D9D9"/>
+              <w:right w:val="single" w:sz="5" w:color="D9D9D9"/>
+            </w:tcBorders>
+            <w:shd w:fill="FFFFFF"/>
+            <w:tcMar>
+              <w:top w:w="95" w:type="dxa"/>
+              <w:left w:w="95" w:type="dxa"/>
+              <w:bottom w:w="95" w:type="dxa"/>
+              <w:right w:w="95" w:type="dxa"/>
+            </w:tcMar>
+          </w:tcPr>
+          <w:p>
+            <w:pPr>
+              <w:spacing w:after="60" w:before="60"/>
+            </w:pPr>
+            <w:r>
+              <w:rPr>
+                <w:b w:val="0"/>
+                <w:color w:val="000000"/>
+                <w:sz w:val="17"/>
+              </w:rPr>
+              <w:t>Administrator provisioning signing secret image dependencies configuration volumes and backups.</w:t>
+            </w:r>
+          </w:p>
+        </w:tc>
+        <w:tc>
+          <w:tcPr>
+            <w:tcW w:type="dxa" w:w="3240"/>
+            <w:vAlign w:val="center"/>
+            <w:tcBorders>
+              <w:top w:val="single" w:sz="5" w:color="D9D9D9"/>
+              <w:left w:val="single" w:sz="5" w:color="D9D9D9"/>
+              <w:bottom w:val="single" w:sz="5" w:color="D9D9D9"/>
+              <w:right w:val="single" w:sz="5" w:color="D9D9D9"/>
+            </w:tcBorders>
+            <w:shd w:fill="FFFFFF"/>
+            <w:tcMar>
+              <w:top w:w="95" w:type="dxa"/>
+              <w:left w:w="95" w:type="dxa"/>
+              <w:bottom w:w="95" w:type="dxa"/>
+              <w:right w:w="95" w:type="dxa"/>
+            </w:tcMar>
+          </w:tcPr>
+          <w:p>
+            <w:pPr>
+              <w:spacing w:after="60" w:before="60"/>
+            </w:pPr>
+            <w:r>
+              <w:rPr>
+                <w:b w:val="0"/>
+                <w:color w:val="000000"/>
+                <w:sz w:val="17"/>
+              </w:rPr>
+              <w:t>Operator-only provisioning; secrets excluded from submission; pinned dependencies; restricted containers and namespace; least privilege. Hosted CI execution immutable audit and NetworkPolicy enforcement retain documented limits.</w:t>
+            </w:r>
+          </w:p>
+        </w:tc>
+        <w:tc>
+          <w:tcPr>
+            <w:tcW w:type="dxa" w:w="1008"/>
+            <w:vAlign w:val="center"/>
+            <w:tcBorders>
+              <w:top w:val="single" w:sz="5" w:color="D9D9D9"/>
+              <w:left w:val="single" w:sz="5" w:color="D9D9D9"/>
+              <w:bottom w:val="single" w:sz="5" w:color="D9D9D9"/>
+              <w:right w:val="single" w:sz="5" w:color="D9D9D9"/>
+            </w:tcBorders>
+            <w:shd w:fill="FFFFFF"/>
+            <w:tcMar>
+              <w:top w:w="95" w:type="dxa"/>
+              <w:left w:w="95" w:type="dxa"/>
+              <w:bottom w:w="95" w:type="dxa"/>
+              <w:right w:w="95" w:type="dxa"/>
+            </w:tcMar>
+          </w:tcPr>
+          <w:p>
+            <w:pPr>
+              <w:spacing w:after="60" w:before="60"/>
+            </w:pPr>
+            <w:r>
+              <w:rPr>
+                <w:b w:val="0"/>
+                <w:color w:val="000000"/>
+                <w:sz w:val="17"/>
+              </w:rPr>
+              <w:t>TH10 TH11</w:t>
+            </w:r>
+          </w:p>
+        </w:tc>
+      </w:tr>
+    </w:tbl>
+    <w:p>
+      <w:pPr>
+        <w:spacing w:after="20" w:line="20" w:lineRule="exact"/>
+      </w:pPr>
+      <w:r>
+        <w:rPr>
+          <w:sz w:val="2"/>
+        </w:rPr>
+      </w:r>
+    </w:p>
+    <w:p>
+      <w:pPr>
+        <w:pStyle w:val="Heading2"/>
+      </w:pPr>
+      <w:r>
+        <w:t>STRIDE threat analysis</w:t>
       </w:r>
     </w:p>
     <w:tbl>
@@ -30561,7 +33966,7 @@
       <w:jc w:val="right"/>
     </w:pPr>
     <w:r>
-      <w:t xml:space="preserve">24CYS401  |  CH.SC.U4CYS23024  |  </w:t>
+      <w:t xml:space="preserve">20CYS401  |  CH.SC.U4CYS23024  |  </w:t>
     </w:r>
     <w:fldSimple w:instr="PAGE"/>
   </w:p>

</xml_diff>